<commit_message>
Add Kawagita tanka corrections, source photos, and misc haiku files
Includes new S9040002-5 and S9070001-5 source photos, transcribed
tanka correction docs for Rob's poem and Hyakunen no Hi, plus new
Kawagita method rules added to SKILL.md.

Co-Authored-By: Claude Sonnet 5 <noreply@anthropic.com>
</commit_message>
<xml_diff>
--- a/100(75+25).docx
+++ b/100(75+25).docx
@@ -9,7 +9,6 @@
         <w:ind/>
         <w:rPr/>
       </w:pPr>
-      <w:r/>
       <w:r>
         <mc:AlternateContent>
           <mc:Choice Requires="wpg">
@@ -79,7 +78,6 @@
                               <w:t xml:space="preserve">Mitsue</w:t>
                             </w:r>
                             <w:r/>
-                            <w:r/>
                           </w:p>
                         </w:txbxContent>
                       </wps:txbx>
@@ -127,7 +125,6 @@
                         <w:t xml:space="preserve">Mitsue</w:t>
                       </w:r>
                       <w:r/>
-                      <w:r/>
                     </w:p>
                   </w:txbxContent>
                 </v:textbox>
@@ -136,7 +133,6 @@
           </mc:Fallback>
         </mc:AlternateContent>
       </w:r>
-      <w:r/>
       <w:r>
         <mc:AlternateContent>
           <mc:Choice Requires="wpg">
@@ -215,11 +211,6 @@
         </mc:AlternateContent>
       </w:r>
       <w:r/>
-      <w:r/>
-      <w:r/>
-      <w:r/>
-      <w:r/>
-      <w:r/>
     </w:p>
     <w:p>
       <w:pPr>
@@ -228,10 +219,6 @@
         <w:ind/>
         <w:rPr/>
       </w:pPr>
-      <w:r/>
-      <w:r/>
-      <w:r/>
-      <w:r/>
       <w:r/>
       <w:r/>
     </w:p>
@@ -254,15 +241,15 @@
         <mc:AlternateContent>
           <mc:Choice Requires="wpg">
             <w:drawing>
-              <wp:anchor xmlns:wp="http://schemas.openxmlformats.org/drawingml/2006/wordprocessingDrawing" xmlns:wp14="http://schemas.microsoft.com/office/word/2010/wordprocessingDrawing" distT="0" distB="0" distL="115200" distR="115200" simplePos="0" relativeHeight="140288" behindDoc="1" locked="0" layoutInCell="1" allowOverlap="1">
+              <wp:anchor xmlns:wp="http://schemas.openxmlformats.org/drawingml/2006/wordprocessingDrawing" xmlns:wp14="http://schemas.microsoft.com/office/word/2010/wordprocessingDrawing" distT="0" distB="0" distL="115200" distR="115200" simplePos="0" relativeHeight="155648" behindDoc="1" locked="0" layoutInCell="1" allowOverlap="1">
                 <wp:simplePos x="0" y="0"/>
                 <wp:positionH relativeFrom="column">
-                  <wp:posOffset>-866363</wp:posOffset>
+                  <wp:posOffset>-913879</wp:posOffset>
                 </wp:positionH>
                 <wp:positionV relativeFrom="paragraph">
-                  <wp:posOffset>1175</wp:posOffset>
+                  <wp:posOffset>0</wp:posOffset>
                 </wp:positionV>
-                <wp:extent cx="7336059" cy="2513967"/>
+                <wp:extent cx="7213714" cy="2058225"/>
                 <wp:effectExtent l="0" t="0" r="0" b="0"/>
                 <wp:wrapNone/>
                 <wp:docPr id="3" name=""/>
@@ -273,7 +260,7 @@
                   <a:graphicData uri="http://schemas.openxmlformats.org/drawingml/2006/picture">
                     <pic:pic xmlns:pic="http://schemas.openxmlformats.org/drawingml/2006/picture">
                       <pic:nvPicPr>
-                        <pic:cNvPr id="473818901" name=""/>
+                        <pic:cNvPr id="2049499397" name=""/>
                         <pic:cNvPicPr>
                           <a:picLocks noChangeAspect="1"/>
                         </pic:cNvPicPr>
@@ -286,7 +273,7 @@
                       <pic:spPr bwMode="auto">
                         <a:xfrm flipH="0" flipV="0">
                           <a:off x="0" y="0"/>
-                          <a:ext cx="7336059" cy="2513967"/>
+                          <a:ext cx="7213714" cy="2058224"/>
                         </a:xfrm>
                         <a:prstGeom prst="rect">
                           <a:avLst/>
@@ -319,7 +306,7 @@
                 <v:path o:extrusionok="f" gradientshapeok="t" o:connecttype="rect"/>
                 <o:lock v:ext="edit" aspectratio="t"/>
               </v:shapetype>
-              <v:shape id="_x0000_i2" o:spid="_x0000_s2" type="#_x0000_t75" style="position:absolute;z-index:-140288;o:allowoverlap:true;o:allowincell:true;mso-position-horizontal-relative:text;margin-left:-68.22pt;mso-position-horizontal:absolute;mso-position-vertical-relative:text;margin-top:0.09pt;mso-position-vertical:absolute;width:577.64pt;height:197.95pt;mso-wrap-distance-left:9.07pt;mso-wrap-distance-top:0.00pt;mso-wrap-distance-right:9.07pt;mso-wrap-distance-bottom:0.00pt;z-index:1;" stroked="false">
+              <v:shape id="_x0000_i2" o:spid="_x0000_s2" type="#_x0000_t75" style="position:absolute;z-index:-155648;o:allowoverlap:true;o:allowincell:true;mso-position-horizontal-relative:text;margin-left:-71.96pt;mso-position-horizontal:absolute;mso-position-vertical-relative:text;margin-top:0.00pt;mso-position-vertical:absolute;width:568.01pt;height:162.06pt;mso-wrap-distance-left:9.07pt;mso-wrap-distance-top:0.00pt;mso-wrap-distance-right:9.07pt;mso-wrap-distance-bottom:0.00pt;z-index:1;" stroked="false">
                 <v:imagedata r:id="rId9" o:title=""/>
                 <o:lock v:ext="edit" rotation="t"/>
               </v:shape>
@@ -327,12 +314,6 @@
           </mc:Fallback>
         </mc:AlternateContent>
       </w:r>
-      <w:r>
-        <w:rPr>
-          <w:lang w:val="ja-JP"/>
-        </w:rPr>
-      </w:r>
-      <w:r/>
       <w:r>
         <w:rPr>
           <w:lang w:val="ja-JP"/>
@@ -359,30 +340,6 @@
       </w:pPr>
       <w:r/>
       <w:r/>
-      <w:r/>
-      <w:r/>
-    </w:p>
-    <w:p>
-      <w:pPr>
-        <w:pBdr/>
-        <w:spacing/>
-        <w:ind/>
-        <w:rPr/>
-      </w:pPr>
-      <w:r/>
-      <w:r/>
-      <w:r/>
-      <w:r/>
-    </w:p>
-    <w:p>
-      <w:pPr>
-        <w:pBdr/>
-        <w:spacing/>
-        <w:ind/>
-        <w:rPr/>
-      </w:pPr>
-      <w:r/>
-      <w:r/>
     </w:p>
     <w:p>
       <w:pPr>
@@ -429,12 +386,12 @@
               <wp:anchor xmlns:wp="http://schemas.openxmlformats.org/drawingml/2006/wordprocessingDrawing" xmlns:wp14="http://schemas.microsoft.com/office/word/2010/wordprocessingDrawing" distT="0" distB="0" distL="115200" distR="115200" simplePos="0" relativeHeight="11264" behindDoc="0" locked="0" layoutInCell="1" allowOverlap="1">
                 <wp:simplePos x="0" y="0"/>
                 <wp:positionH relativeFrom="column">
-                  <wp:posOffset>-747306</wp:posOffset>
+                  <wp:posOffset>5336362</wp:posOffset>
                 </wp:positionH>
                 <wp:positionV relativeFrom="paragraph">
-                  <wp:posOffset>267436</wp:posOffset>
+                  <wp:posOffset>161705</wp:posOffset>
                 </wp:positionV>
-                <wp:extent cx="792140" cy="929664"/>
+                <wp:extent cx="985917" cy="1520700"/>
                 <wp:effectExtent l="3175" t="3175" r="3175" b="3175"/>
                 <wp:wrapNone/>
                 <wp:docPr id="4" name=""/>
@@ -442,12 +399,12 @@
                 <a:graphic xmlns:a="http://schemas.openxmlformats.org/drawingml/2006/main">
                   <a:graphicData uri="http://schemas.microsoft.com/office/word/2010/wordprocessingShape">
                     <wps:wsp>
-                      <wps:cNvPr id="530432810" name=""/>
+                      <wps:cNvPr id="154599388" name=""/>
                       <wps:cNvSpPr txBox="1"/>
                       <wps:spPr bwMode="auto">
                         <a:xfrm rot="0" flipH="0" flipV="0">
                           <a:off x="0" y="0"/>
-                          <a:ext cx="792139" cy="929664"/>
+                          <a:ext cx="985915" cy="1520698"/>
                         </a:xfrm>
                         <a:prstGeom prst="rect">
                           <a:avLst/>
@@ -480,9 +437,68 @@
                                 <w:sz w:val="16"/>
                                 <w:szCs w:val="16"/>
                               </w:rPr>
-                              <w:t xml:space="preserve">Deeper than human dreams,</w:t>
+                              <w:t xml:space="preserve">For their children's homes,</w:t>
                             </w:r>
-                            <w:r/>
+                            <w:r>
+                              <w:rPr>
+                                <w:rFonts w:ascii="Open Sans" w:hAnsi="Open Sans" w:eastAsia="Open Sans" w:cs="Open Sans"/>
+                                <w:b w:val="0"/>
+                                <w:bCs w:val="0"/>
+                                <w:sz w:val="16"/>
+                                <w:szCs w:val="16"/>
+                              </w:rPr>
+                            </w:r>
+                            <w:r>
+                              <w:rPr>
+                                <w:rFonts w:ascii="Open Sans" w:hAnsi="Open Sans" w:eastAsia="Open Sans" w:cs="Open Sans"/>
+                                <w:b w:val="0"/>
+                                <w:bCs w:val="0"/>
+                                <w:sz w:val="16"/>
+                                <w:szCs w:val="16"/>
+                              </w:rPr>
+                            </w:r>
+                            <w:r>
+                              <w:rPr>
+                                <w:rFonts w:ascii="Open Sans" w:hAnsi="Open Sans" w:eastAsia="Open Sans" w:cs="Open Sans"/>
+                                <w:b w:val="0"/>
+                                <w:bCs w:val="0"/>
+                                <w:sz w:val="16"/>
+                                <w:szCs w:val="16"/>
+                              </w:rPr>
+                            </w:r>
+                          </w:p>
+                          <w:p>
+                            <w:pPr>
+                              <w:pBdr/>
+                              <w:spacing w:after="0" w:afterAutospacing="0" w:line="235" w:lineRule="auto"/>
+                              <w:ind/>
+                              <w:rPr>
+                                <w:rFonts w:ascii="Open Sans" w:hAnsi="Open Sans" w:eastAsia="Open Sans" w:cs="Open Sans"/>
+                                <w:b w:val="0"/>
+                                <w:bCs w:val="0"/>
+                                <w:sz w:val="16"/>
+                                <w:szCs w:val="16"/>
+                              </w:rPr>
+                            </w:pPr>
+                            <w:r>
+                              <w:rPr>
+                                <w:rFonts w:ascii="Open Sans" w:hAnsi="Open Sans" w:eastAsia="Open Sans" w:cs="Open Sans"/>
+                                <w:b w:val="0"/>
+                                <w:bCs w:val="0"/>
+                                <w:sz w:val="16"/>
+                                <w:szCs w:val="16"/>
+                              </w:rPr>
+                              <w:t xml:space="preserve">sugi saplings enter the earth</w:t>
+                            </w:r>
+                            <w:r>
+                              <w:rPr>
+                                <w:rFonts w:ascii="Open Sans" w:hAnsi="Open Sans" w:eastAsia="Open Sans" w:cs="Open Sans"/>
+                                <w:b w:val="0"/>
+                                <w:bCs w:val="0"/>
+                                <w:sz w:val="16"/>
+                                <w:szCs w:val="16"/>
+                              </w:rPr>
+                            </w:r>
                             <w:r>
                               <w:rPr>
                                 <w:rFonts w:ascii="Open Sans" w:hAnsi="Open Sans" w:eastAsia="Open Sans" w:cs="Open Sans"/>
@@ -523,17 +539,7 @@
                                 <w:sz w:val="16"/>
                                 <w:szCs w:val="16"/>
                               </w:rPr>
-                              <w:t xml:space="preserve">there are roots.</w:t>
-                            </w:r>
-                            <w:r/>
-                            <w:r>
-                              <w:rPr>
-                                <w:rFonts w:ascii="Open Sans" w:hAnsi="Open Sans" w:eastAsia="Open Sans" w:cs="Open Sans"/>
-                                <w:b w:val="0"/>
-                                <w:bCs w:val="0"/>
-                                <w:sz w:val="16"/>
-                                <w:szCs w:val="16"/>
-                              </w:rPr>
+                              <w:t xml:space="preserve">in the spring.</w:t>
                             </w:r>
                             <w:r>
                               <w:rPr>
@@ -574,7 +580,7 @@
           </mc:Choice>
           <mc:Fallback>
             <w:pict>
-              <v:shape id="shape 3" o:spid="_x0000_s3" o:spt="202" type="#_x0000_t202" style="position:absolute;z-index:11264;o:allowoverlap:true;o:allowincell:true;mso-position-horizontal-relative:text;margin-left:-58.84pt;mso-position-horizontal:absolute;mso-position-vertical-relative:text;margin-top:21.06pt;mso-position-vertical:absolute;width:62.37pt;height:73.20pt;mso-wrap-distance-left:9.07pt;mso-wrap-distance-top:0.00pt;mso-wrap-distance-right:9.07pt;mso-wrap-distance-bottom:0.00pt;rotation:0;v-text-anchor:top;visibility:visible;" filled="f" stroked="f" strokeweight="0.50pt">
+              <v:shape id="shape 3" o:spid="_x0000_s3" o:spt="202" type="#_x0000_t202" style="position:absolute;z-index:11264;o:allowoverlap:true;o:allowincell:true;mso-position-horizontal-relative:text;margin-left:420.19pt;mso-position-horizontal:absolute;mso-position-vertical-relative:text;margin-top:12.73pt;mso-position-vertical:absolute;width:77.63pt;height:119.74pt;mso-wrap-distance-left:9.07pt;mso-wrap-distance-top:0.00pt;mso-wrap-distance-right:9.07pt;mso-wrap-distance-bottom:0.00pt;rotation:0;v-text-anchor:top;visibility:visible;" filled="f" stroked="f" strokeweight="0.50pt">
                 <v:textbox inset="0,0,0,0">
                   <w:txbxContent>
                     <w:p>
@@ -598,9 +604,68 @@
                           <w:sz w:val="16"/>
                           <w:szCs w:val="16"/>
                         </w:rPr>
-                        <w:t xml:space="preserve">Deeper than human dreams,</w:t>
+                        <w:t xml:space="preserve">For their children's homes,</w:t>
                       </w:r>
-                      <w:r/>
+                      <w:r>
+                        <w:rPr>
+                          <w:rFonts w:ascii="Open Sans" w:hAnsi="Open Sans" w:eastAsia="Open Sans" w:cs="Open Sans"/>
+                          <w:b w:val="0"/>
+                          <w:bCs w:val="0"/>
+                          <w:sz w:val="16"/>
+                          <w:szCs w:val="16"/>
+                        </w:rPr>
+                      </w:r>
+                      <w:r>
+                        <w:rPr>
+                          <w:rFonts w:ascii="Open Sans" w:hAnsi="Open Sans" w:eastAsia="Open Sans" w:cs="Open Sans"/>
+                          <w:b w:val="0"/>
+                          <w:bCs w:val="0"/>
+                          <w:sz w:val="16"/>
+                          <w:szCs w:val="16"/>
+                        </w:rPr>
+                      </w:r>
+                      <w:r>
+                        <w:rPr>
+                          <w:rFonts w:ascii="Open Sans" w:hAnsi="Open Sans" w:eastAsia="Open Sans" w:cs="Open Sans"/>
+                          <w:b w:val="0"/>
+                          <w:bCs w:val="0"/>
+                          <w:sz w:val="16"/>
+                          <w:szCs w:val="16"/>
+                        </w:rPr>
+                      </w:r>
+                    </w:p>
+                    <w:p>
+                      <w:pPr>
+                        <w:pBdr/>
+                        <w:spacing w:after="0" w:afterAutospacing="0" w:line="235" w:lineRule="auto"/>
+                        <w:ind/>
+                        <w:rPr>
+                          <w:rFonts w:ascii="Open Sans" w:hAnsi="Open Sans" w:eastAsia="Open Sans" w:cs="Open Sans"/>
+                          <w:b w:val="0"/>
+                          <w:bCs w:val="0"/>
+                          <w:sz w:val="16"/>
+                          <w:szCs w:val="16"/>
+                        </w:rPr>
+                      </w:pPr>
+                      <w:r>
+                        <w:rPr>
+                          <w:rFonts w:ascii="Open Sans" w:hAnsi="Open Sans" w:eastAsia="Open Sans" w:cs="Open Sans"/>
+                          <w:b w:val="0"/>
+                          <w:bCs w:val="0"/>
+                          <w:sz w:val="16"/>
+                          <w:szCs w:val="16"/>
+                        </w:rPr>
+                        <w:t xml:space="preserve">sugi saplings enter the earth</w:t>
+                      </w:r>
+                      <w:r>
+                        <w:rPr>
+                          <w:rFonts w:ascii="Open Sans" w:hAnsi="Open Sans" w:eastAsia="Open Sans" w:cs="Open Sans"/>
+                          <w:b w:val="0"/>
+                          <w:bCs w:val="0"/>
+                          <w:sz w:val="16"/>
+                          <w:szCs w:val="16"/>
+                        </w:rPr>
+                      </w:r>
                       <w:r>
                         <w:rPr>
                           <w:rFonts w:ascii="Open Sans" w:hAnsi="Open Sans" w:eastAsia="Open Sans" w:cs="Open Sans"/>
@@ -641,17 +706,7 @@
                           <w:sz w:val="16"/>
                           <w:szCs w:val="16"/>
                         </w:rPr>
-                        <w:t xml:space="preserve">there are roots.</w:t>
-                      </w:r>
-                      <w:r/>
-                      <w:r>
-                        <w:rPr>
-                          <w:rFonts w:ascii="Open Sans" w:hAnsi="Open Sans" w:eastAsia="Open Sans" w:cs="Open Sans"/>
-                          <w:b w:val="0"/>
-                          <w:bCs w:val="0"/>
-                          <w:sz w:val="16"/>
-                          <w:szCs w:val="16"/>
-                        </w:rPr>
+                        <w:t xml:space="preserve">in the spring.</w:t>
                       </w:r>
                       <w:r>
                         <w:rPr>
@@ -696,12 +751,12 @@
               <wp:anchor xmlns:wp="http://schemas.openxmlformats.org/drawingml/2006/wordprocessingDrawing" xmlns:wp14="http://schemas.microsoft.com/office/word/2010/wordprocessingDrawing" distT="0" distB="0" distL="115200" distR="115200" simplePos="0" relativeHeight="11264" behindDoc="0" locked="0" layoutInCell="1" allowOverlap="1">
                 <wp:simplePos x="0" y="0"/>
                 <wp:positionH relativeFrom="column">
-                  <wp:posOffset>329019</wp:posOffset>
+                  <wp:posOffset>4250512</wp:posOffset>
                 </wp:positionH>
                 <wp:positionV relativeFrom="paragraph">
-                  <wp:posOffset>267436</wp:posOffset>
+                  <wp:posOffset>161705</wp:posOffset>
                 </wp:positionV>
-                <wp:extent cx="1145968" cy="1030141"/>
+                <wp:extent cx="971550" cy="929664"/>
                 <wp:effectExtent l="3175" t="3175" r="3175" b="3175"/>
                 <wp:wrapNone/>
                 <wp:docPr id="5" name=""/>
@@ -709,12 +764,12 @@
                 <a:graphic xmlns:a="http://schemas.openxmlformats.org/drawingml/2006/main">
                   <a:graphicData uri="http://schemas.microsoft.com/office/word/2010/wordprocessingShape">
                     <wps:wsp>
-                      <wps:cNvPr id="1306947533" name=""/>
+                      <wps:cNvPr id="1261842287" name=""/>
                       <wps:cNvSpPr txBox="1"/>
                       <wps:spPr bwMode="auto">
                         <a:xfrm rot="0" flipH="0" flipV="0">
                           <a:off x="0" y="0"/>
-                          <a:ext cx="1145967" cy="1030141"/>
+                          <a:ext cx="971550" cy="929664"/>
                         </a:xfrm>
                         <a:prstGeom prst="rect">
                           <a:avLst/>
@@ -747,9 +802,17 @@
                                 <w:sz w:val="16"/>
                                 <w:szCs w:val="16"/>
                               </w:rPr>
-                              <w:t xml:space="preserve">Within the wood,</w:t>
+                              <w:t xml:space="preserve">For lives far away,</w:t>
                             </w:r>
-                            <w:r/>
+                            <w:r>
+                              <w:rPr>
+                                <w:rFonts w:ascii="Open Sans" w:hAnsi="Open Sans" w:eastAsia="Open Sans" w:cs="Open Sans"/>
+                                <w:b w:val="0"/>
+                                <w:bCs w:val="0"/>
+                                <w:sz w:val="16"/>
+                                <w:szCs w:val="16"/>
+                              </w:rPr>
+                            </w:r>
                             <w:r>
                               <w:rPr>
                                 <w:rFonts w:ascii="Open Sans" w:hAnsi="Open Sans" w:eastAsia="Open Sans" w:cs="Open Sans"/>
@@ -790,9 +853,672 @@
                                 <w:sz w:val="16"/>
                                 <w:szCs w:val="16"/>
                               </w:rPr>
-                              <w:t xml:space="preserve">a nameless prayer</w:t>
+                              <w:t xml:space="preserve">the warmth of human hands</w:t>
                             </w:r>
-                            <w:r/>
+                            <w:r>
+                              <w:rPr>
+                                <w:rFonts w:ascii="Open Sans" w:hAnsi="Open Sans" w:eastAsia="Open Sans" w:cs="Open Sans"/>
+                                <w:b w:val="0"/>
+                                <w:bCs w:val="0"/>
+                                <w:sz w:val="16"/>
+                                <w:szCs w:val="16"/>
+                              </w:rPr>
+                            </w:r>
+                            <w:r>
+                              <w:rPr>
+                                <w:rFonts w:ascii="Open Sans" w:hAnsi="Open Sans" w:eastAsia="Open Sans" w:cs="Open Sans"/>
+                                <w:b w:val="0"/>
+                                <w:bCs w:val="0"/>
+                                <w:sz w:val="16"/>
+                                <w:szCs w:val="16"/>
+                              </w:rPr>
+                            </w:r>
+                            <w:r>
+                              <w:rPr>
+                                <w:rFonts w:ascii="Open Sans" w:hAnsi="Open Sans" w:eastAsia="Open Sans" w:cs="Open Sans"/>
+                                <w:b w:val="0"/>
+                                <w:bCs w:val="0"/>
+                                <w:sz w:val="16"/>
+                                <w:szCs w:val="16"/>
+                              </w:rPr>
+                            </w:r>
+                          </w:p>
+                          <w:p>
+                            <w:pPr>
+                              <w:pBdr/>
+                              <w:spacing w:after="0" w:afterAutospacing="0" w:line="235" w:lineRule="auto"/>
+                              <w:ind/>
+                              <w:rPr>
+                                <w:rFonts w:ascii="Open Sans" w:hAnsi="Open Sans" w:eastAsia="Open Sans" w:cs="Open Sans"/>
+                                <w:b w:val="0"/>
+                                <w:bCs w:val="0"/>
+                                <w:sz w:val="16"/>
+                                <w:szCs w:val="16"/>
+                              </w:rPr>
+                            </w:pPr>
+                            <w:r>
+                              <w:rPr>
+                                <w:rFonts w:ascii="Open Sans" w:hAnsi="Open Sans" w:eastAsia="Open Sans" w:cs="Open Sans"/>
+                                <w:b w:val="0"/>
+                                <w:bCs w:val="0"/>
+                                <w:sz w:val="16"/>
+                                <w:szCs w:val="16"/>
+                              </w:rPr>
+                              <w:t xml:space="preserve">remains.</w:t>
+                            </w:r>
+                            <w:r>
+                              <w:rPr>
+                                <w:rFonts w:ascii="Open Sans" w:hAnsi="Open Sans" w:eastAsia="Open Sans" w:cs="Open Sans"/>
+                                <w:b w:val="0"/>
+                                <w:bCs w:val="0"/>
+                                <w:sz w:val="16"/>
+                                <w:szCs w:val="16"/>
+                              </w:rPr>
+                            </w:r>
+                            <w:r>
+                              <w:rPr>
+                                <w:rFonts w:ascii="Open Sans" w:hAnsi="Open Sans" w:eastAsia="Open Sans" w:cs="Open Sans"/>
+                                <w:b w:val="0"/>
+                                <w:bCs w:val="0"/>
+                                <w:sz w:val="16"/>
+                                <w:szCs w:val="16"/>
+                              </w:rPr>
+                            </w:r>
+                            <w:r>
+                              <w:rPr>
+                                <w:rFonts w:ascii="Open Sans" w:hAnsi="Open Sans" w:eastAsia="Open Sans" w:cs="Open Sans"/>
+                                <w:b w:val="0"/>
+                                <w:bCs w:val="0"/>
+                                <w:sz w:val="16"/>
+                                <w:szCs w:val="16"/>
+                              </w:rPr>
+                            </w:r>
+                          </w:p>
+                        </w:txbxContent>
+                      </wps:txbx>
+                      <wps:bodyPr vertOverflow="overflow" horzOverflow="overflow" vert="horz" wrap="square" lIns="91440" tIns="45720" rIns="91440" bIns="45720" numCol="1" spcCol="0" rtlCol="0" fromWordArt="0" anchor="t" anchorCtr="0" forceAA="0" upright="0" compatLnSpc="0"/>
+                    </wps:wsp>
+                  </a:graphicData>
+                </a:graphic>
+              </wp:anchor>
+            </w:drawing>
+          </mc:Choice>
+          <mc:Fallback>
+            <w:pict>
+              <v:shape id="shape 4" o:spid="_x0000_s4" o:spt="202" type="#_x0000_t202" style="position:absolute;z-index:11264;o:allowoverlap:true;o:allowincell:true;mso-position-horizontal-relative:text;margin-left:334.69pt;mso-position-horizontal:absolute;mso-position-vertical-relative:text;margin-top:12.73pt;mso-position-vertical:absolute;width:76.50pt;height:73.20pt;mso-wrap-distance-left:9.07pt;mso-wrap-distance-top:0.00pt;mso-wrap-distance-right:9.07pt;mso-wrap-distance-bottom:0.00pt;rotation:0;v-text-anchor:top;visibility:visible;" filled="f" stroked="f" strokeweight="0.50pt">
+                <v:textbox inset="0,0,0,0">
+                  <w:txbxContent>
+                    <w:p>
+                      <w:pPr>
+                        <w:pBdr/>
+                        <w:spacing w:after="0" w:afterAutospacing="0" w:line="235" w:lineRule="auto"/>
+                        <w:ind/>
+                        <w:rPr>
+                          <w:rFonts w:ascii="Open Sans" w:hAnsi="Open Sans" w:eastAsia="Open Sans" w:cs="Open Sans"/>
+                          <w:b w:val="0"/>
+                          <w:bCs w:val="0"/>
+                          <w:sz w:val="16"/>
+                          <w:szCs w:val="16"/>
+                        </w:rPr>
+                      </w:pPr>
+                      <w:r>
+                        <w:rPr>
+                          <w:rFonts w:ascii="Open Sans" w:hAnsi="Open Sans" w:eastAsia="Open Sans" w:cs="Open Sans"/>
+                          <w:b w:val="0"/>
+                          <w:bCs w:val="0"/>
+                          <w:sz w:val="16"/>
+                          <w:szCs w:val="16"/>
+                        </w:rPr>
+                        <w:t xml:space="preserve">For lives far away,</w:t>
+                      </w:r>
+                      <w:r>
+                        <w:rPr>
+                          <w:rFonts w:ascii="Open Sans" w:hAnsi="Open Sans" w:eastAsia="Open Sans" w:cs="Open Sans"/>
+                          <w:b w:val="0"/>
+                          <w:bCs w:val="0"/>
+                          <w:sz w:val="16"/>
+                          <w:szCs w:val="16"/>
+                        </w:rPr>
+                      </w:r>
+                      <w:r>
+                        <w:rPr>
+                          <w:rFonts w:ascii="Open Sans" w:hAnsi="Open Sans" w:eastAsia="Open Sans" w:cs="Open Sans"/>
+                          <w:b w:val="0"/>
+                          <w:bCs w:val="0"/>
+                          <w:sz w:val="16"/>
+                          <w:szCs w:val="16"/>
+                        </w:rPr>
+                      </w:r>
+                      <w:r>
+                        <w:rPr>
+                          <w:rFonts w:ascii="Open Sans" w:hAnsi="Open Sans" w:eastAsia="Open Sans" w:cs="Open Sans"/>
+                          <w:b w:val="0"/>
+                          <w:bCs w:val="0"/>
+                          <w:sz w:val="16"/>
+                          <w:szCs w:val="16"/>
+                        </w:rPr>
+                      </w:r>
+                    </w:p>
+                    <w:p>
+                      <w:pPr>
+                        <w:pBdr/>
+                        <w:spacing w:after="0" w:afterAutospacing="0" w:line="235" w:lineRule="auto"/>
+                        <w:ind/>
+                        <w:rPr>
+                          <w:rFonts w:ascii="Open Sans" w:hAnsi="Open Sans" w:eastAsia="Open Sans" w:cs="Open Sans"/>
+                          <w:b w:val="0"/>
+                          <w:bCs w:val="0"/>
+                          <w:sz w:val="16"/>
+                          <w:szCs w:val="16"/>
+                        </w:rPr>
+                      </w:pPr>
+                      <w:r>
+                        <w:rPr>
+                          <w:rFonts w:ascii="Open Sans" w:hAnsi="Open Sans" w:eastAsia="Open Sans" w:cs="Open Sans"/>
+                          <w:b w:val="0"/>
+                          <w:bCs w:val="0"/>
+                          <w:sz w:val="16"/>
+                          <w:szCs w:val="16"/>
+                        </w:rPr>
+                        <w:t xml:space="preserve">the warmth of human hands</w:t>
+                      </w:r>
+                      <w:r>
+                        <w:rPr>
+                          <w:rFonts w:ascii="Open Sans" w:hAnsi="Open Sans" w:eastAsia="Open Sans" w:cs="Open Sans"/>
+                          <w:b w:val="0"/>
+                          <w:bCs w:val="0"/>
+                          <w:sz w:val="16"/>
+                          <w:szCs w:val="16"/>
+                        </w:rPr>
+                      </w:r>
+                      <w:r>
+                        <w:rPr>
+                          <w:rFonts w:ascii="Open Sans" w:hAnsi="Open Sans" w:eastAsia="Open Sans" w:cs="Open Sans"/>
+                          <w:b w:val="0"/>
+                          <w:bCs w:val="0"/>
+                          <w:sz w:val="16"/>
+                          <w:szCs w:val="16"/>
+                        </w:rPr>
+                      </w:r>
+                      <w:r>
+                        <w:rPr>
+                          <w:rFonts w:ascii="Open Sans" w:hAnsi="Open Sans" w:eastAsia="Open Sans" w:cs="Open Sans"/>
+                          <w:b w:val="0"/>
+                          <w:bCs w:val="0"/>
+                          <w:sz w:val="16"/>
+                          <w:szCs w:val="16"/>
+                        </w:rPr>
+                      </w:r>
+                    </w:p>
+                    <w:p>
+                      <w:pPr>
+                        <w:pBdr/>
+                        <w:spacing w:after="0" w:afterAutospacing="0" w:line="235" w:lineRule="auto"/>
+                        <w:ind/>
+                        <w:rPr>
+                          <w:rFonts w:ascii="Open Sans" w:hAnsi="Open Sans" w:eastAsia="Open Sans" w:cs="Open Sans"/>
+                          <w:b w:val="0"/>
+                          <w:bCs w:val="0"/>
+                          <w:sz w:val="16"/>
+                          <w:szCs w:val="16"/>
+                        </w:rPr>
+                      </w:pPr>
+                      <w:r>
+                        <w:rPr>
+                          <w:rFonts w:ascii="Open Sans" w:hAnsi="Open Sans" w:eastAsia="Open Sans" w:cs="Open Sans"/>
+                          <w:b w:val="0"/>
+                          <w:bCs w:val="0"/>
+                          <w:sz w:val="16"/>
+                          <w:szCs w:val="16"/>
+                        </w:rPr>
+                        <w:t xml:space="preserve">remains.</w:t>
+                      </w:r>
+                      <w:r>
+                        <w:rPr>
+                          <w:rFonts w:ascii="Open Sans" w:hAnsi="Open Sans" w:eastAsia="Open Sans" w:cs="Open Sans"/>
+                          <w:b w:val="0"/>
+                          <w:bCs w:val="0"/>
+                          <w:sz w:val="16"/>
+                          <w:szCs w:val="16"/>
+                        </w:rPr>
+                      </w:r>
+                      <w:r>
+                        <w:rPr>
+                          <w:rFonts w:ascii="Open Sans" w:hAnsi="Open Sans" w:eastAsia="Open Sans" w:cs="Open Sans"/>
+                          <w:b w:val="0"/>
+                          <w:bCs w:val="0"/>
+                          <w:sz w:val="16"/>
+                          <w:szCs w:val="16"/>
+                        </w:rPr>
+                      </w:r>
+                      <w:r>
+                        <w:rPr>
+                          <w:rFonts w:ascii="Open Sans" w:hAnsi="Open Sans" w:eastAsia="Open Sans" w:cs="Open Sans"/>
+                          <w:b w:val="0"/>
+                          <w:bCs w:val="0"/>
+                          <w:sz w:val="16"/>
+                          <w:szCs w:val="16"/>
+                        </w:rPr>
+                      </w:r>
+                    </w:p>
+                  </w:txbxContent>
+                </v:textbox>
+              </v:shape>
+            </w:pict>
+          </mc:Fallback>
+        </mc:AlternateContent>
+      </w:r>
+      <w:r/>
+      <w:r>
+        <mc:AlternateContent>
+          <mc:Choice Requires="wpg">
+            <w:drawing>
+              <wp:anchor xmlns:wp="http://schemas.openxmlformats.org/drawingml/2006/wordprocessingDrawing" xmlns:wp14="http://schemas.microsoft.com/office/word/2010/wordprocessingDrawing" distT="0" distB="0" distL="115200" distR="115200" simplePos="0" relativeHeight="11264" behindDoc="0" locked="0" layoutInCell="1" allowOverlap="1">
+                <wp:simplePos x="0" y="0"/>
+                <wp:positionH relativeFrom="column">
+                  <wp:posOffset>2803054</wp:posOffset>
+                </wp:positionH>
+                <wp:positionV relativeFrom="paragraph">
+                  <wp:posOffset>161705</wp:posOffset>
+                </wp:positionV>
+                <wp:extent cx="1090839" cy="1610751"/>
+                <wp:effectExtent l="3175" t="3175" r="3175" b="3175"/>
+                <wp:wrapNone/>
+                <wp:docPr id="6" name=""/>
+                <wp:cNvGraphicFramePr/>
+                <a:graphic xmlns:a="http://schemas.openxmlformats.org/drawingml/2006/main">
+                  <a:graphicData uri="http://schemas.microsoft.com/office/word/2010/wordprocessingShape">
+                    <wps:wsp>
+                      <wps:cNvPr id="208327478" name=""/>
+                      <wps:cNvSpPr txBox="1"/>
+                      <wps:spPr bwMode="auto">
+                        <a:xfrm rot="0" flipH="0" flipV="0">
+                          <a:off x="0" y="0"/>
+                          <a:ext cx="1090837" cy="1610749"/>
+                        </a:xfrm>
+                        <a:prstGeom prst="rect">
+                          <a:avLst/>
+                        </a:prstGeom>
+                        <a:noFill/>
+                        <a:ln w="6350">
+                          <a:noFill/>
+                        </a:ln>
+                      </wps:spPr>
+                      <wps:txbx>
+                        <w:txbxContent>
+                          <w:p>
+                            <w:pPr>
+                              <w:pBdr/>
+                              <w:spacing w:after="0" w:afterAutospacing="0" w:line="235" w:lineRule="auto"/>
+                              <w:ind/>
+                              <w:rPr>
+                                <w:rFonts w:ascii="Open Sans" w:hAnsi="Open Sans" w:eastAsia="Open Sans" w:cs="Open Sans"/>
+                                <w:b w:val="0"/>
+                                <w:bCs w:val="0"/>
+                                <w:sz w:val="16"/>
+                                <w:szCs w:val="16"/>
+                              </w:rPr>
+                            </w:pPr>
+                            <w:r>
+                              <w:rPr>
+                                <w:rFonts w:ascii="Open Sans" w:hAnsi="Open Sans" w:eastAsia="Open Sans" w:cs="Open Sans"/>
+                                <w:b w:val="0"/>
+                                <w:bCs w:val="0"/>
+                                <w:sz w:val="16"/>
+                                <w:szCs w:val="16"/>
+                              </w:rPr>
+                              <w:t xml:space="preserve">Seventy-five years—</w:t>
+                            </w:r>
+                            <w:r>
+                              <w:rPr>
+                                <w:rFonts w:ascii="Open Sans" w:hAnsi="Open Sans" w:eastAsia="Open Sans" w:cs="Open Sans"/>
+                                <w:b w:val="0"/>
+                                <w:bCs w:val="0"/>
+                                <w:sz w:val="16"/>
+                                <w:szCs w:val="16"/>
+                              </w:rPr>
+                            </w:r>
+                            <w:r>
+                              <w:rPr>
+                                <w:rFonts w:ascii="Open Sans" w:hAnsi="Open Sans" w:eastAsia="Open Sans" w:cs="Open Sans"/>
+                                <w:b w:val="0"/>
+                                <w:bCs w:val="0"/>
+                                <w:sz w:val="16"/>
+                                <w:szCs w:val="16"/>
+                              </w:rPr>
+                            </w:r>
+                            <w:r>
+                              <w:rPr>
+                                <w:rFonts w:ascii="Open Sans" w:hAnsi="Open Sans" w:eastAsia="Open Sans" w:cs="Open Sans"/>
+                                <w:b w:val="0"/>
+                                <w:bCs w:val="0"/>
+                                <w:sz w:val="16"/>
+                                <w:szCs w:val="16"/>
+                              </w:rPr>
+                            </w:r>
+                          </w:p>
+                          <w:p>
+                            <w:pPr>
+                              <w:pBdr/>
+                              <w:spacing w:after="0" w:afterAutospacing="0" w:line="235" w:lineRule="auto"/>
+                              <w:ind/>
+                              <w:rPr>
+                                <w:rFonts w:ascii="Open Sans" w:hAnsi="Open Sans" w:eastAsia="Open Sans" w:cs="Open Sans"/>
+                                <w:b w:val="0"/>
+                                <w:bCs w:val="0"/>
+                                <w:sz w:val="16"/>
+                                <w:szCs w:val="16"/>
+                              </w:rPr>
+                            </w:pPr>
+                            <w:r>
+                              <w:rPr>
+                                <w:rFonts w:ascii="Open Sans" w:hAnsi="Open Sans" w:eastAsia="Open Sans" w:cs="Open Sans"/>
+                                <w:b w:val="0"/>
+                                <w:bCs w:val="0"/>
+                                <w:sz w:val="16"/>
+                                <w:szCs w:val="16"/>
+                              </w:rPr>
+                              <w:t xml:space="preserve">the sugi reach toward heaven</w:t>
+                            </w:r>
+                            <w:r>
+                              <w:rPr>
+                                <w:rFonts w:ascii="Open Sans" w:hAnsi="Open Sans" w:eastAsia="Open Sans" w:cs="Open Sans"/>
+                                <w:b w:val="0"/>
+                                <w:bCs w:val="0"/>
+                                <w:sz w:val="16"/>
+                                <w:szCs w:val="16"/>
+                              </w:rPr>
+                            </w:r>
+                            <w:r>
+                              <w:rPr>
+                                <w:rFonts w:ascii="Open Sans" w:hAnsi="Open Sans" w:eastAsia="Open Sans" w:cs="Open Sans"/>
+                                <w:b w:val="0"/>
+                                <w:bCs w:val="0"/>
+                                <w:sz w:val="16"/>
+                                <w:szCs w:val="16"/>
+                              </w:rPr>
+                            </w:r>
+                            <w:r>
+                              <w:rPr>
+                                <w:rFonts w:ascii="Open Sans" w:hAnsi="Open Sans" w:eastAsia="Open Sans" w:cs="Open Sans"/>
+                                <w:b w:val="0"/>
+                                <w:bCs w:val="0"/>
+                                <w:sz w:val="16"/>
+                                <w:szCs w:val="16"/>
+                              </w:rPr>
+                            </w:r>
+                          </w:p>
+                          <w:p>
+                            <w:pPr>
+                              <w:pBdr/>
+                              <w:spacing w:after="0" w:afterAutospacing="0" w:line="235" w:lineRule="auto"/>
+                              <w:ind/>
+                              <w:rPr>
+                                <w:sz w:val="16"/>
+                                <w:szCs w:val="16"/>
+                              </w:rPr>
+                            </w:pPr>
+                            <w:r>
+                              <w:rPr>
+                                <w:rFonts w:ascii="Open Sans" w:hAnsi="Open Sans" w:eastAsia="Open Sans" w:cs="Open Sans"/>
+                                <w:b w:val="0"/>
+                                <w:bCs w:val="0"/>
+                                <w:sz w:val="16"/>
+                                <w:szCs w:val="16"/>
+                              </w:rPr>
+                              <w:t xml:space="preserve">and grow old.</w:t>
+                            </w:r>
+                            <w:r>
+                              <w:rPr>
+                                <w:sz w:val="16"/>
+                                <w:szCs w:val="16"/>
+                              </w:rPr>
+                            </w:r>
+                            <w:r>
+                              <w:rPr>
+                                <w:sz w:val="16"/>
+                                <w:szCs w:val="16"/>
+                              </w:rPr>
+                            </w:r>
+                            <w:r>
+                              <w:rPr>
+                                <w:sz w:val="16"/>
+                                <w:szCs w:val="16"/>
+                              </w:rPr>
+                            </w:r>
+                          </w:p>
+                        </w:txbxContent>
+                      </wps:txbx>
+                      <wps:bodyPr vertOverflow="overflow" horzOverflow="overflow" vert="horz" wrap="square" lIns="91440" tIns="45720" rIns="91440" bIns="45720" numCol="1" spcCol="0" rtlCol="0" fromWordArt="0" anchor="t" anchorCtr="0" forceAA="0" upright="0" compatLnSpc="0"/>
+                    </wps:wsp>
+                  </a:graphicData>
+                </a:graphic>
+              </wp:anchor>
+            </w:drawing>
+          </mc:Choice>
+          <mc:Fallback>
+            <w:pict>
+              <v:shape id="shape 5" o:spid="_x0000_s5" o:spt="202" type="#_x0000_t202" style="position:absolute;z-index:11264;o:allowoverlap:true;o:allowincell:true;mso-position-horizontal-relative:text;margin-left:220.71pt;mso-position-horizontal:absolute;mso-position-vertical-relative:text;margin-top:12.73pt;mso-position-vertical:absolute;width:85.89pt;height:126.83pt;mso-wrap-distance-left:9.07pt;mso-wrap-distance-top:0.00pt;mso-wrap-distance-right:9.07pt;mso-wrap-distance-bottom:0.00pt;rotation:0;v-text-anchor:top;visibility:visible;" filled="f" stroked="f" strokeweight="0.50pt">
+                <v:textbox inset="0,0,0,0">
+                  <w:txbxContent>
+                    <w:p>
+                      <w:pPr>
+                        <w:pBdr/>
+                        <w:spacing w:after="0" w:afterAutospacing="0" w:line="235" w:lineRule="auto"/>
+                        <w:ind/>
+                        <w:rPr>
+                          <w:rFonts w:ascii="Open Sans" w:hAnsi="Open Sans" w:eastAsia="Open Sans" w:cs="Open Sans"/>
+                          <w:b w:val="0"/>
+                          <w:bCs w:val="0"/>
+                          <w:sz w:val="16"/>
+                          <w:szCs w:val="16"/>
+                        </w:rPr>
+                      </w:pPr>
+                      <w:r>
+                        <w:rPr>
+                          <w:rFonts w:ascii="Open Sans" w:hAnsi="Open Sans" w:eastAsia="Open Sans" w:cs="Open Sans"/>
+                          <w:b w:val="0"/>
+                          <w:bCs w:val="0"/>
+                          <w:sz w:val="16"/>
+                          <w:szCs w:val="16"/>
+                        </w:rPr>
+                        <w:t xml:space="preserve">Seventy-five years—</w:t>
+                      </w:r>
+                      <w:r>
+                        <w:rPr>
+                          <w:rFonts w:ascii="Open Sans" w:hAnsi="Open Sans" w:eastAsia="Open Sans" w:cs="Open Sans"/>
+                          <w:b w:val="0"/>
+                          <w:bCs w:val="0"/>
+                          <w:sz w:val="16"/>
+                          <w:szCs w:val="16"/>
+                        </w:rPr>
+                      </w:r>
+                      <w:r>
+                        <w:rPr>
+                          <w:rFonts w:ascii="Open Sans" w:hAnsi="Open Sans" w:eastAsia="Open Sans" w:cs="Open Sans"/>
+                          <w:b w:val="0"/>
+                          <w:bCs w:val="0"/>
+                          <w:sz w:val="16"/>
+                          <w:szCs w:val="16"/>
+                        </w:rPr>
+                      </w:r>
+                      <w:r>
+                        <w:rPr>
+                          <w:rFonts w:ascii="Open Sans" w:hAnsi="Open Sans" w:eastAsia="Open Sans" w:cs="Open Sans"/>
+                          <w:b w:val="0"/>
+                          <w:bCs w:val="0"/>
+                          <w:sz w:val="16"/>
+                          <w:szCs w:val="16"/>
+                        </w:rPr>
+                      </w:r>
+                    </w:p>
+                    <w:p>
+                      <w:pPr>
+                        <w:pBdr/>
+                        <w:spacing w:after="0" w:afterAutospacing="0" w:line="235" w:lineRule="auto"/>
+                        <w:ind/>
+                        <w:rPr>
+                          <w:rFonts w:ascii="Open Sans" w:hAnsi="Open Sans" w:eastAsia="Open Sans" w:cs="Open Sans"/>
+                          <w:b w:val="0"/>
+                          <w:bCs w:val="0"/>
+                          <w:sz w:val="16"/>
+                          <w:szCs w:val="16"/>
+                        </w:rPr>
+                      </w:pPr>
+                      <w:r>
+                        <w:rPr>
+                          <w:rFonts w:ascii="Open Sans" w:hAnsi="Open Sans" w:eastAsia="Open Sans" w:cs="Open Sans"/>
+                          <w:b w:val="0"/>
+                          <w:bCs w:val="0"/>
+                          <w:sz w:val="16"/>
+                          <w:szCs w:val="16"/>
+                        </w:rPr>
+                        <w:t xml:space="preserve">the sugi reach toward heaven</w:t>
+                      </w:r>
+                      <w:r>
+                        <w:rPr>
+                          <w:rFonts w:ascii="Open Sans" w:hAnsi="Open Sans" w:eastAsia="Open Sans" w:cs="Open Sans"/>
+                          <w:b w:val="0"/>
+                          <w:bCs w:val="0"/>
+                          <w:sz w:val="16"/>
+                          <w:szCs w:val="16"/>
+                        </w:rPr>
+                      </w:r>
+                      <w:r>
+                        <w:rPr>
+                          <w:rFonts w:ascii="Open Sans" w:hAnsi="Open Sans" w:eastAsia="Open Sans" w:cs="Open Sans"/>
+                          <w:b w:val="0"/>
+                          <w:bCs w:val="0"/>
+                          <w:sz w:val="16"/>
+                          <w:szCs w:val="16"/>
+                        </w:rPr>
+                      </w:r>
+                      <w:r>
+                        <w:rPr>
+                          <w:rFonts w:ascii="Open Sans" w:hAnsi="Open Sans" w:eastAsia="Open Sans" w:cs="Open Sans"/>
+                          <w:b w:val="0"/>
+                          <w:bCs w:val="0"/>
+                          <w:sz w:val="16"/>
+                          <w:szCs w:val="16"/>
+                        </w:rPr>
+                      </w:r>
+                    </w:p>
+                    <w:p>
+                      <w:pPr>
+                        <w:pBdr/>
+                        <w:spacing w:after="0" w:afterAutospacing="0" w:line="235" w:lineRule="auto"/>
+                        <w:ind/>
+                        <w:rPr>
+                          <w:sz w:val="16"/>
+                          <w:szCs w:val="16"/>
+                        </w:rPr>
+                      </w:pPr>
+                      <w:r>
+                        <w:rPr>
+                          <w:rFonts w:ascii="Open Sans" w:hAnsi="Open Sans" w:eastAsia="Open Sans" w:cs="Open Sans"/>
+                          <w:b w:val="0"/>
+                          <w:bCs w:val="0"/>
+                          <w:sz w:val="16"/>
+                          <w:szCs w:val="16"/>
+                        </w:rPr>
+                        <w:t xml:space="preserve">and grow old.</w:t>
+                      </w:r>
+                      <w:r>
+                        <w:rPr>
+                          <w:sz w:val="16"/>
+                          <w:szCs w:val="16"/>
+                        </w:rPr>
+                      </w:r>
+                      <w:r>
+                        <w:rPr>
+                          <w:sz w:val="16"/>
+                          <w:szCs w:val="16"/>
+                        </w:rPr>
+                      </w:r>
+                      <w:r>
+                        <w:rPr>
+                          <w:sz w:val="16"/>
+                          <w:szCs w:val="16"/>
+                        </w:rPr>
+                      </w:r>
+                    </w:p>
+                  </w:txbxContent>
+                </v:textbox>
+              </v:shape>
+            </w:pict>
+          </mc:Fallback>
+        </mc:AlternateContent>
+      </w:r>
+      <w:r/>
+      <w:r>
+        <mc:AlternateContent>
+          <mc:Choice Requires="wpg">
+            <w:drawing>
+              <wp:anchor xmlns:wp="http://schemas.openxmlformats.org/drawingml/2006/wordprocessingDrawing" xmlns:wp14="http://schemas.microsoft.com/office/word/2010/wordprocessingDrawing" distT="0" distB="0" distL="115200" distR="115200" simplePos="0" relativeHeight="11264" behindDoc="0" locked="0" layoutInCell="1" allowOverlap="1">
+                <wp:simplePos x="0" y="0"/>
+                <wp:positionH relativeFrom="column">
+                  <wp:posOffset>1811277</wp:posOffset>
+                </wp:positionH>
+                <wp:positionV relativeFrom="paragraph">
+                  <wp:posOffset>161705</wp:posOffset>
+                </wp:positionV>
+                <wp:extent cx="734259" cy="1030141"/>
+                <wp:effectExtent l="3175" t="3175" r="3175" b="3175"/>
+                <wp:wrapNone/>
+                <wp:docPr id="7" name=""/>
+                <wp:cNvGraphicFramePr/>
+                <a:graphic xmlns:a="http://schemas.openxmlformats.org/drawingml/2006/main">
+                  <a:graphicData uri="http://schemas.microsoft.com/office/word/2010/wordprocessingShape">
+                    <wps:wsp>
+                      <wps:cNvPr id="1452558766" name=""/>
+                      <wps:cNvSpPr txBox="1"/>
+                      <wps:spPr bwMode="auto">
+                        <a:xfrm rot="0" flipH="0" flipV="0">
+                          <a:off x="0" y="0"/>
+                          <a:ext cx="734258" cy="1030140"/>
+                        </a:xfrm>
+                        <a:prstGeom prst="rect">
+                          <a:avLst/>
+                        </a:prstGeom>
+                        <a:noFill/>
+                        <a:ln w="6350">
+                          <a:noFill/>
+                        </a:ln>
+                      </wps:spPr>
+                      <wps:txbx>
+                        <w:txbxContent>
+                          <w:p>
+                            <w:pPr>
+                              <w:pBdr/>
+                              <w:spacing w:after="0" w:afterAutospacing="0" w:line="235" w:lineRule="auto"/>
+                              <w:ind/>
+                              <w:rPr>
+                                <w:rFonts w:ascii="Open Sans" w:hAnsi="Open Sans" w:eastAsia="Open Sans" w:cs="Open Sans"/>
+                                <w:b w:val="0"/>
+                                <w:bCs w:val="0"/>
+                                <w:sz w:val="16"/>
+                                <w:szCs w:val="16"/>
+                              </w:rPr>
+                            </w:pPr>
+                            <w:r>
+                              <w:rPr>
+                                <w:rFonts w:ascii="Open Sans" w:hAnsi="Open Sans" w:eastAsia="Open Sans" w:cs="Open Sans"/>
+                                <w:b w:val="0"/>
+                                <w:bCs w:val="0"/>
+                                <w:sz w:val="16"/>
+                                <w:szCs w:val="16"/>
+                              </w:rPr>
+                              <w:t xml:space="preserve">The birds wait for fruit;</w:t>
+                            </w:r>
+                            <w:r>
+                              <w:rPr>
+                                <w:rFonts w:ascii="Open Sans" w:hAnsi="Open Sans" w:eastAsia="Open Sans" w:cs="Open Sans"/>
+                                <w:b w:val="0"/>
+                                <w:bCs w:val="0"/>
+                                <w:sz w:val="16"/>
+                                <w:szCs w:val="16"/>
+                              </w:rPr>
+                            </w:r>
                             <w:r>
                               <w:rPr>
                                 <w:rFonts w:ascii="Open Sans" w:hAnsi="Open Sans" w:eastAsia="Open Sans" w:cs="Open Sans"/>
@@ -833,17 +1559,7 @@
                                 <w:sz w:val="16"/>
                                 <w:szCs w:val="16"/>
                               </w:rPr>
-                              <w:t xml:space="preserve">crosses the years.</w:t>
-                            </w:r>
-                            <w:r/>
-                            <w:r>
-                              <w:rPr>
-                                <w:rFonts w:ascii="Open Sans" w:hAnsi="Open Sans" w:eastAsia="Open Sans" w:cs="Open Sans"/>
-                                <w:b w:val="0"/>
-                                <w:bCs w:val="0"/>
-                                <w:sz w:val="16"/>
-                                <w:szCs w:val="16"/>
-                              </w:rPr>
+                              <w:t xml:space="preserve">the deer eat only moonlight.</w:t>
                             </w:r>
                             <w:r>
                               <w:rPr>
@@ -884,7 +1600,7 @@
           </mc:Choice>
           <mc:Fallback>
             <w:pict>
-              <v:shape id="shape 4" o:spid="_x0000_s4" o:spt="202" type="#_x0000_t202" style="position:absolute;z-index:11264;o:allowoverlap:true;o:allowincell:true;mso-position-horizontal-relative:text;margin-left:25.91pt;mso-position-horizontal:absolute;mso-position-vertical-relative:text;margin-top:21.06pt;mso-position-vertical:absolute;width:90.23pt;height:81.11pt;mso-wrap-distance-left:9.07pt;mso-wrap-distance-top:0.00pt;mso-wrap-distance-right:9.07pt;mso-wrap-distance-bottom:0.00pt;rotation:0;v-text-anchor:top;visibility:visible;" filled="f" stroked="f" strokeweight="0.50pt">
+              <v:shape id="shape 6" o:spid="_x0000_s6" o:spt="202" type="#_x0000_t202" style="position:absolute;z-index:11264;o:allowoverlap:true;o:allowincell:true;mso-position-horizontal-relative:text;margin-left:142.62pt;mso-position-horizontal:absolute;mso-position-vertical-relative:text;margin-top:12.73pt;mso-position-vertical:absolute;width:57.82pt;height:81.11pt;mso-wrap-distance-left:9.07pt;mso-wrap-distance-top:0.00pt;mso-wrap-distance-right:9.07pt;mso-wrap-distance-bottom:0.00pt;rotation:0;v-text-anchor:top;visibility:visible;" filled="f" stroked="f" strokeweight="0.50pt">
                 <v:textbox inset="0,0,0,0">
                   <w:txbxContent>
                     <w:p>
@@ -908,17 +1624,7 @@
                           <w:sz w:val="16"/>
                           <w:szCs w:val="16"/>
                         </w:rPr>
-                        <w:t xml:space="preserve">Within the wood,</w:t>
-                      </w:r>
-                      <w:r/>
-                      <w:r>
-                        <w:rPr>
-                          <w:rFonts w:ascii="Open Sans" w:hAnsi="Open Sans" w:eastAsia="Open Sans" w:cs="Open Sans"/>
-                          <w:b w:val="0"/>
-                          <w:bCs w:val="0"/>
-                          <w:sz w:val="16"/>
-                          <w:szCs w:val="16"/>
-                        </w:rPr>
+                        <w:t xml:space="preserve">The birds wait for fruit;</w:t>
                       </w:r>
                       <w:r>
                         <w:rPr>
@@ -929,31 +1635,6 @@
                           <w:szCs w:val="16"/>
                         </w:rPr>
                       </w:r>
-                    </w:p>
-                    <w:p>
-                      <w:pPr>
-                        <w:pBdr/>
-                        <w:spacing w:after="0" w:afterAutospacing="0" w:line="235" w:lineRule="auto"/>
-                        <w:ind/>
-                        <w:rPr>
-                          <w:rFonts w:ascii="Open Sans" w:hAnsi="Open Sans" w:eastAsia="Open Sans" w:cs="Open Sans"/>
-                          <w:b w:val="0"/>
-                          <w:bCs w:val="0"/>
-                          <w:sz w:val="16"/>
-                          <w:szCs w:val="16"/>
-                        </w:rPr>
-                      </w:pPr>
-                      <w:r>
-                        <w:rPr>
-                          <w:rFonts w:ascii="Open Sans" w:hAnsi="Open Sans" w:eastAsia="Open Sans" w:cs="Open Sans"/>
-                          <w:b w:val="0"/>
-                          <w:bCs w:val="0"/>
-                          <w:sz w:val="16"/>
-                          <w:szCs w:val="16"/>
-                        </w:rPr>
-                        <w:t xml:space="preserve">a nameless prayer</w:t>
-                      </w:r>
-                      <w:r/>
                       <w:r>
                         <w:rPr>
                           <w:rFonts w:ascii="Open Sans" w:hAnsi="Open Sans" w:eastAsia="Open Sans" w:cs="Open Sans"/>
@@ -994,17 +1675,7 @@
                           <w:sz w:val="16"/>
                           <w:szCs w:val="16"/>
                         </w:rPr>
-                        <w:t xml:space="preserve">crosses the years.</w:t>
-                      </w:r>
-                      <w:r/>
-                      <w:r>
-                        <w:rPr>
-                          <w:rFonts w:ascii="Open Sans" w:hAnsi="Open Sans" w:eastAsia="Open Sans" w:cs="Open Sans"/>
-                          <w:b w:val="0"/>
-                          <w:bCs w:val="0"/>
-                          <w:sz w:val="16"/>
-                          <w:szCs w:val="16"/>
-                        </w:rPr>
+                        <w:t xml:space="preserve">the deer eat only moonlight.</w:t>
                       </w:r>
                       <w:r>
                         <w:rPr>
@@ -1049,25 +1720,25 @@
               <wp:anchor xmlns:wp="http://schemas.openxmlformats.org/drawingml/2006/wordprocessingDrawing" xmlns:wp14="http://schemas.microsoft.com/office/word/2010/wordprocessingDrawing" distT="0" distB="0" distL="115200" distR="115200" simplePos="0" relativeHeight="11264" behindDoc="0" locked="0" layoutInCell="1" allowOverlap="1">
                 <wp:simplePos x="0" y="0"/>
                 <wp:positionH relativeFrom="column">
-                  <wp:posOffset>1766459</wp:posOffset>
+                  <wp:posOffset>373837</wp:posOffset>
                 </wp:positionH>
                 <wp:positionV relativeFrom="paragraph">
-                  <wp:posOffset>267436</wp:posOffset>
+                  <wp:posOffset>161705</wp:posOffset>
                 </wp:positionV>
-                <wp:extent cx="734259" cy="1030141"/>
+                <wp:extent cx="1145968" cy="1030141"/>
                 <wp:effectExtent l="3175" t="3175" r="3175" b="3175"/>
                 <wp:wrapNone/>
-                <wp:docPr id="6" name=""/>
+                <wp:docPr id="8" name=""/>
                 <wp:cNvGraphicFramePr/>
                 <a:graphic xmlns:a="http://schemas.openxmlformats.org/drawingml/2006/main">
                   <a:graphicData uri="http://schemas.microsoft.com/office/word/2010/wordprocessingShape">
                     <wps:wsp>
-                      <wps:cNvPr id="1882468511" name=""/>
+                      <wps:cNvPr id="101261616" name=""/>
                       <wps:cNvSpPr txBox="1"/>
                       <wps:spPr bwMode="auto">
                         <a:xfrm rot="0" flipH="0" flipV="0">
                           <a:off x="0" y="0"/>
-                          <a:ext cx="734259" cy="1030141"/>
+                          <a:ext cx="1145966" cy="1030140"/>
                         </a:xfrm>
                         <a:prstGeom prst="rect">
                           <a:avLst/>
@@ -1100,9 +1771,68 @@
                                 <w:sz w:val="16"/>
                                 <w:szCs w:val="16"/>
                               </w:rPr>
-                              <w:t xml:space="preserve">The birds wait for fruit;</w:t>
+                              <w:t xml:space="preserve">Within the wood,</w:t>
                             </w:r>
-                            <w:r/>
+                            <w:r>
+                              <w:rPr>
+                                <w:rFonts w:ascii="Open Sans" w:hAnsi="Open Sans" w:eastAsia="Open Sans" w:cs="Open Sans"/>
+                                <w:b w:val="0"/>
+                                <w:bCs w:val="0"/>
+                                <w:sz w:val="16"/>
+                                <w:szCs w:val="16"/>
+                              </w:rPr>
+                            </w:r>
+                            <w:r>
+                              <w:rPr>
+                                <w:rFonts w:ascii="Open Sans" w:hAnsi="Open Sans" w:eastAsia="Open Sans" w:cs="Open Sans"/>
+                                <w:b w:val="0"/>
+                                <w:bCs w:val="0"/>
+                                <w:sz w:val="16"/>
+                                <w:szCs w:val="16"/>
+                              </w:rPr>
+                            </w:r>
+                            <w:r>
+                              <w:rPr>
+                                <w:rFonts w:ascii="Open Sans" w:hAnsi="Open Sans" w:eastAsia="Open Sans" w:cs="Open Sans"/>
+                                <w:b w:val="0"/>
+                                <w:bCs w:val="0"/>
+                                <w:sz w:val="16"/>
+                                <w:szCs w:val="16"/>
+                              </w:rPr>
+                            </w:r>
+                          </w:p>
+                          <w:p>
+                            <w:pPr>
+                              <w:pBdr/>
+                              <w:spacing w:after="0" w:afterAutospacing="0" w:line="235" w:lineRule="auto"/>
+                              <w:ind/>
+                              <w:rPr>
+                                <w:rFonts w:ascii="Open Sans" w:hAnsi="Open Sans" w:eastAsia="Open Sans" w:cs="Open Sans"/>
+                                <w:b w:val="0"/>
+                                <w:bCs w:val="0"/>
+                                <w:sz w:val="16"/>
+                                <w:szCs w:val="16"/>
+                              </w:rPr>
+                            </w:pPr>
+                            <w:r>
+                              <w:rPr>
+                                <w:rFonts w:ascii="Open Sans" w:hAnsi="Open Sans" w:eastAsia="Open Sans" w:cs="Open Sans"/>
+                                <w:b w:val="0"/>
+                                <w:bCs w:val="0"/>
+                                <w:sz w:val="16"/>
+                                <w:szCs w:val="16"/>
+                              </w:rPr>
+                              <w:t xml:space="preserve">a nameless prayer</w:t>
+                            </w:r>
+                            <w:r>
+                              <w:rPr>
+                                <w:rFonts w:ascii="Open Sans" w:hAnsi="Open Sans" w:eastAsia="Open Sans" w:cs="Open Sans"/>
+                                <w:b w:val="0"/>
+                                <w:bCs w:val="0"/>
+                                <w:sz w:val="16"/>
+                                <w:szCs w:val="16"/>
+                              </w:rPr>
+                            </w:r>
                             <w:r>
                               <w:rPr>
                                 <w:rFonts w:ascii="Open Sans" w:hAnsi="Open Sans" w:eastAsia="Open Sans" w:cs="Open Sans"/>
@@ -1143,17 +1873,7 @@
                                 <w:sz w:val="16"/>
                                 <w:szCs w:val="16"/>
                               </w:rPr>
-                              <w:t xml:space="preserve">the deer eat only moonlight.</w:t>
-                            </w:r>
-                            <w:r/>
-                            <w:r>
-                              <w:rPr>
-                                <w:rFonts w:ascii="Open Sans" w:hAnsi="Open Sans" w:eastAsia="Open Sans" w:cs="Open Sans"/>
-                                <w:b w:val="0"/>
-                                <w:bCs w:val="0"/>
-                                <w:sz w:val="16"/>
-                                <w:szCs w:val="16"/>
-                              </w:rPr>
+                              <w:t xml:space="preserve">crosses the years.</w:t>
                             </w:r>
                             <w:r>
                               <w:rPr>
@@ -1194,7 +1914,7 @@
           </mc:Choice>
           <mc:Fallback>
             <w:pict>
-              <v:shape id="shape 5" o:spid="_x0000_s5" o:spt="202" type="#_x0000_t202" style="position:absolute;z-index:11264;o:allowoverlap:true;o:allowincell:true;mso-position-horizontal-relative:text;margin-left:139.09pt;mso-position-horizontal:absolute;mso-position-vertical-relative:text;margin-top:21.06pt;mso-position-vertical:absolute;width:57.82pt;height:81.11pt;mso-wrap-distance-left:9.07pt;mso-wrap-distance-top:0.00pt;mso-wrap-distance-right:9.07pt;mso-wrap-distance-bottom:0.00pt;rotation:0;v-text-anchor:top;visibility:visible;" filled="f" stroked="f" strokeweight="0.50pt">
+              <v:shape id="shape 7" o:spid="_x0000_s7" o:spt="202" type="#_x0000_t202" style="position:absolute;z-index:11264;o:allowoverlap:true;o:allowincell:true;mso-position-horizontal-relative:text;margin-left:29.44pt;mso-position-horizontal:absolute;mso-position-vertical-relative:text;margin-top:12.73pt;mso-position-vertical:absolute;width:90.23pt;height:81.11pt;mso-wrap-distance-left:9.07pt;mso-wrap-distance-top:0.00pt;mso-wrap-distance-right:9.07pt;mso-wrap-distance-bottom:0.00pt;rotation:0;v-text-anchor:top;visibility:visible;" filled="f" stroked="f" strokeweight="0.50pt">
                 <v:textbox inset="0,0,0,0">
                   <w:txbxContent>
                     <w:p>
@@ -1218,9 +1938,68 @@
                           <w:sz w:val="16"/>
                           <w:szCs w:val="16"/>
                         </w:rPr>
-                        <w:t xml:space="preserve">The birds wait for fruit;</w:t>
+                        <w:t xml:space="preserve">Within the wood,</w:t>
                       </w:r>
-                      <w:r/>
+                      <w:r>
+                        <w:rPr>
+                          <w:rFonts w:ascii="Open Sans" w:hAnsi="Open Sans" w:eastAsia="Open Sans" w:cs="Open Sans"/>
+                          <w:b w:val="0"/>
+                          <w:bCs w:val="0"/>
+                          <w:sz w:val="16"/>
+                          <w:szCs w:val="16"/>
+                        </w:rPr>
+                      </w:r>
+                      <w:r>
+                        <w:rPr>
+                          <w:rFonts w:ascii="Open Sans" w:hAnsi="Open Sans" w:eastAsia="Open Sans" w:cs="Open Sans"/>
+                          <w:b w:val="0"/>
+                          <w:bCs w:val="0"/>
+                          <w:sz w:val="16"/>
+                          <w:szCs w:val="16"/>
+                        </w:rPr>
+                      </w:r>
+                      <w:r>
+                        <w:rPr>
+                          <w:rFonts w:ascii="Open Sans" w:hAnsi="Open Sans" w:eastAsia="Open Sans" w:cs="Open Sans"/>
+                          <w:b w:val="0"/>
+                          <w:bCs w:val="0"/>
+                          <w:sz w:val="16"/>
+                          <w:szCs w:val="16"/>
+                        </w:rPr>
+                      </w:r>
+                    </w:p>
+                    <w:p>
+                      <w:pPr>
+                        <w:pBdr/>
+                        <w:spacing w:after="0" w:afterAutospacing="0" w:line="235" w:lineRule="auto"/>
+                        <w:ind/>
+                        <w:rPr>
+                          <w:rFonts w:ascii="Open Sans" w:hAnsi="Open Sans" w:eastAsia="Open Sans" w:cs="Open Sans"/>
+                          <w:b w:val="0"/>
+                          <w:bCs w:val="0"/>
+                          <w:sz w:val="16"/>
+                          <w:szCs w:val="16"/>
+                        </w:rPr>
+                      </w:pPr>
+                      <w:r>
+                        <w:rPr>
+                          <w:rFonts w:ascii="Open Sans" w:hAnsi="Open Sans" w:eastAsia="Open Sans" w:cs="Open Sans"/>
+                          <w:b w:val="0"/>
+                          <w:bCs w:val="0"/>
+                          <w:sz w:val="16"/>
+                          <w:szCs w:val="16"/>
+                        </w:rPr>
+                        <w:t xml:space="preserve">a nameless prayer</w:t>
+                      </w:r>
+                      <w:r>
+                        <w:rPr>
+                          <w:rFonts w:ascii="Open Sans" w:hAnsi="Open Sans" w:eastAsia="Open Sans" w:cs="Open Sans"/>
+                          <w:b w:val="0"/>
+                          <w:bCs w:val="0"/>
+                          <w:sz w:val="16"/>
+                          <w:szCs w:val="16"/>
+                        </w:rPr>
+                      </w:r>
                       <w:r>
                         <w:rPr>
                           <w:rFonts w:ascii="Open Sans" w:hAnsi="Open Sans" w:eastAsia="Open Sans" w:cs="Open Sans"/>
@@ -1261,17 +2040,7 @@
                           <w:sz w:val="16"/>
                           <w:szCs w:val="16"/>
                         </w:rPr>
-                        <w:t xml:space="preserve">the deer eat only moonlight.</w:t>
-                      </w:r>
-                      <w:r/>
-                      <w:r>
-                        <w:rPr>
-                          <w:rFonts w:ascii="Open Sans" w:hAnsi="Open Sans" w:eastAsia="Open Sans" w:cs="Open Sans"/>
-                          <w:b w:val="0"/>
-                          <w:bCs w:val="0"/>
-                          <w:sz w:val="16"/>
-                          <w:szCs w:val="16"/>
-                        </w:rPr>
+                        <w:t xml:space="preserve">crosses the years.</w:t>
                       </w:r>
                       <w:r>
                         <w:rPr>
@@ -1316,25 +2085,25 @@
               <wp:anchor xmlns:wp="http://schemas.openxmlformats.org/drawingml/2006/wordprocessingDrawing" xmlns:wp14="http://schemas.microsoft.com/office/word/2010/wordprocessingDrawing" distT="0" distB="0" distL="115200" distR="115200" simplePos="0" relativeHeight="11264" behindDoc="0" locked="0" layoutInCell="1" allowOverlap="1">
                 <wp:simplePos x="0" y="0"/>
                 <wp:positionH relativeFrom="column">
-                  <wp:posOffset>2758236</wp:posOffset>
+                  <wp:posOffset>-702488</wp:posOffset>
                 </wp:positionH>
                 <wp:positionV relativeFrom="paragraph">
-                  <wp:posOffset>267436</wp:posOffset>
+                  <wp:posOffset>161705</wp:posOffset>
                 </wp:positionV>
-                <wp:extent cx="1090839" cy="1610751"/>
+                <wp:extent cx="792140" cy="929664"/>
                 <wp:effectExtent l="3175" t="3175" r="3175" b="3175"/>
                 <wp:wrapNone/>
-                <wp:docPr id="7" name=""/>
+                <wp:docPr id="9" name=""/>
                 <wp:cNvGraphicFramePr/>
                 <a:graphic xmlns:a="http://schemas.openxmlformats.org/drawingml/2006/main">
                   <a:graphicData uri="http://schemas.microsoft.com/office/word/2010/wordprocessingShape">
                     <wps:wsp>
-                      <wps:cNvPr id="874157905" name=""/>
+                      <wps:cNvPr id="1991658783" name=""/>
                       <wps:cNvSpPr txBox="1"/>
                       <wps:spPr bwMode="auto">
                         <a:xfrm rot="0" flipH="0" flipV="0">
                           <a:off x="0" y="0"/>
-                          <a:ext cx="1090838" cy="1610750"/>
+                          <a:ext cx="792138" cy="929664"/>
                         </a:xfrm>
                         <a:prstGeom prst="rect">
                           <a:avLst/>
@@ -1367,17 +2136,7 @@
                                 <w:sz w:val="16"/>
                                 <w:szCs w:val="16"/>
                               </w:rPr>
-                              <w:t xml:space="preserve">Seventy-five years—</w:t>
-                            </w:r>
-                            <w:r/>
-                            <w:r>
-                              <w:rPr>
-                                <w:rFonts w:ascii="Open Sans" w:hAnsi="Open Sans" w:eastAsia="Open Sans" w:cs="Open Sans"/>
-                                <w:b w:val="0"/>
-                                <w:bCs w:val="0"/>
-                                <w:sz w:val="16"/>
-                                <w:szCs w:val="16"/>
-                              </w:rPr>
+                              <w:t xml:space="preserve">Deeper than human dreams,</w:t>
                             </w:r>
                             <w:r>
                               <w:rPr>
@@ -1388,713 +2147,6 @@
                                 <w:szCs w:val="16"/>
                               </w:rPr>
                             </w:r>
-                          </w:p>
-                          <w:p>
-                            <w:pPr>
-                              <w:pBdr/>
-                              <w:spacing w:after="0" w:afterAutospacing="0" w:line="235" w:lineRule="auto"/>
-                              <w:ind/>
-                              <w:rPr>
-                                <w:rFonts w:ascii="Open Sans" w:hAnsi="Open Sans" w:eastAsia="Open Sans" w:cs="Open Sans"/>
-                                <w:b w:val="0"/>
-                                <w:bCs w:val="0"/>
-                                <w:sz w:val="16"/>
-                                <w:szCs w:val="16"/>
-                              </w:rPr>
-                            </w:pPr>
-                            <w:r>
-                              <w:rPr>
-                                <w:rFonts w:ascii="Open Sans" w:hAnsi="Open Sans" w:eastAsia="Open Sans" w:cs="Open Sans"/>
-                                <w:b w:val="0"/>
-                                <w:bCs w:val="0"/>
-                                <w:sz w:val="16"/>
-                                <w:szCs w:val="16"/>
-                              </w:rPr>
-                              <w:t xml:space="preserve">the sugi reach toward heaven</w:t>
-                            </w:r>
-                            <w:r/>
-                            <w:r>
-                              <w:rPr>
-                                <w:rFonts w:ascii="Open Sans" w:hAnsi="Open Sans" w:eastAsia="Open Sans" w:cs="Open Sans"/>
-                                <w:b w:val="0"/>
-                                <w:bCs w:val="0"/>
-                                <w:sz w:val="16"/>
-                                <w:szCs w:val="16"/>
-                              </w:rPr>
-                            </w:r>
-                            <w:r>
-                              <w:rPr>
-                                <w:rFonts w:ascii="Open Sans" w:hAnsi="Open Sans" w:eastAsia="Open Sans" w:cs="Open Sans"/>
-                                <w:b w:val="0"/>
-                                <w:bCs w:val="0"/>
-                                <w:sz w:val="16"/>
-                                <w:szCs w:val="16"/>
-                              </w:rPr>
-                            </w:r>
-                          </w:p>
-                          <w:p>
-                            <w:pPr>
-                              <w:pBdr/>
-                              <w:spacing w:after="0" w:afterAutospacing="0" w:line="235" w:lineRule="auto"/>
-                              <w:ind/>
-                              <w:rPr>
-                                <w:sz w:val="16"/>
-                                <w:szCs w:val="16"/>
-                              </w:rPr>
-                            </w:pPr>
-                            <w:r>
-                              <w:rPr>
-                                <w:rFonts w:ascii="Open Sans" w:hAnsi="Open Sans" w:eastAsia="Open Sans" w:cs="Open Sans"/>
-                                <w:b w:val="0"/>
-                                <w:bCs w:val="0"/>
-                                <w:sz w:val="16"/>
-                                <w:szCs w:val="16"/>
-                              </w:rPr>
-                              <w:t xml:space="preserve">and grow old.</w:t>
-                            </w:r>
-                            <w:r/>
-                            <w:r>
-                              <w:rPr>
-                                <w:rFonts w:ascii="Open Sans" w:hAnsi="Open Sans" w:eastAsia="Open Sans" w:cs="Open Sans"/>
-                                <w:b w:val="0"/>
-                                <w:bCs w:val="0"/>
-                                <w:sz w:val="16"/>
-                                <w:szCs w:val="16"/>
-                              </w:rPr>
-                            </w:r>
-                            <w:r>
-                              <w:rPr>
-                                <w:sz w:val="16"/>
-                                <w:szCs w:val="16"/>
-                              </w:rPr>
-                            </w:r>
-                            <w:r>
-                              <w:rPr>
-                                <w:sz w:val="16"/>
-                                <w:szCs w:val="16"/>
-                              </w:rPr>
-                            </w:r>
-                            <w:r>
-                              <w:rPr>
-                                <w:sz w:val="16"/>
-                                <w:szCs w:val="16"/>
-                              </w:rPr>
-                            </w:r>
-                          </w:p>
-                        </w:txbxContent>
-                      </wps:txbx>
-                      <wps:bodyPr vertOverflow="overflow" horzOverflow="overflow" vert="horz" wrap="square" lIns="91440" tIns="45720" rIns="91440" bIns="45720" numCol="1" spcCol="0" rtlCol="0" fromWordArt="0" anchor="t" anchorCtr="0" forceAA="0" upright="0" compatLnSpc="0"/>
-                    </wps:wsp>
-                  </a:graphicData>
-                </a:graphic>
-              </wp:anchor>
-            </w:drawing>
-          </mc:Choice>
-          <mc:Fallback>
-            <w:pict>
-              <v:shape id="shape 6" o:spid="_x0000_s6" o:spt="202" type="#_x0000_t202" style="position:absolute;z-index:11264;o:allowoverlap:true;o:allowincell:true;mso-position-horizontal-relative:text;margin-left:217.18pt;mso-position-horizontal:absolute;mso-position-vertical-relative:text;margin-top:21.06pt;mso-position-vertical:absolute;width:85.89pt;height:126.83pt;mso-wrap-distance-left:9.07pt;mso-wrap-distance-top:0.00pt;mso-wrap-distance-right:9.07pt;mso-wrap-distance-bottom:0.00pt;rotation:0;v-text-anchor:top;visibility:visible;" filled="f" stroked="f" strokeweight="0.50pt">
-                <v:textbox inset="0,0,0,0">
-                  <w:txbxContent>
-                    <w:p>
-                      <w:pPr>
-                        <w:pBdr/>
-                        <w:spacing w:after="0" w:afterAutospacing="0" w:line="235" w:lineRule="auto"/>
-                        <w:ind/>
-                        <w:rPr>
-                          <w:rFonts w:ascii="Open Sans" w:hAnsi="Open Sans" w:eastAsia="Open Sans" w:cs="Open Sans"/>
-                          <w:b w:val="0"/>
-                          <w:bCs w:val="0"/>
-                          <w:sz w:val="16"/>
-                          <w:szCs w:val="16"/>
-                        </w:rPr>
-                      </w:pPr>
-                      <w:r>
-                        <w:rPr>
-                          <w:rFonts w:ascii="Open Sans" w:hAnsi="Open Sans" w:eastAsia="Open Sans" w:cs="Open Sans"/>
-                          <w:b w:val="0"/>
-                          <w:bCs w:val="0"/>
-                          <w:sz w:val="16"/>
-                          <w:szCs w:val="16"/>
-                        </w:rPr>
-                        <w:t xml:space="preserve">Seventy-five years—</w:t>
-                      </w:r>
-                      <w:r/>
-                      <w:r>
-                        <w:rPr>
-                          <w:rFonts w:ascii="Open Sans" w:hAnsi="Open Sans" w:eastAsia="Open Sans" w:cs="Open Sans"/>
-                          <w:b w:val="0"/>
-                          <w:bCs w:val="0"/>
-                          <w:sz w:val="16"/>
-                          <w:szCs w:val="16"/>
-                        </w:rPr>
-                      </w:r>
-                      <w:r>
-                        <w:rPr>
-                          <w:rFonts w:ascii="Open Sans" w:hAnsi="Open Sans" w:eastAsia="Open Sans" w:cs="Open Sans"/>
-                          <w:b w:val="0"/>
-                          <w:bCs w:val="0"/>
-                          <w:sz w:val="16"/>
-                          <w:szCs w:val="16"/>
-                        </w:rPr>
-                      </w:r>
-                    </w:p>
-                    <w:p>
-                      <w:pPr>
-                        <w:pBdr/>
-                        <w:spacing w:after="0" w:afterAutospacing="0" w:line="235" w:lineRule="auto"/>
-                        <w:ind/>
-                        <w:rPr>
-                          <w:rFonts w:ascii="Open Sans" w:hAnsi="Open Sans" w:eastAsia="Open Sans" w:cs="Open Sans"/>
-                          <w:b w:val="0"/>
-                          <w:bCs w:val="0"/>
-                          <w:sz w:val="16"/>
-                          <w:szCs w:val="16"/>
-                        </w:rPr>
-                      </w:pPr>
-                      <w:r>
-                        <w:rPr>
-                          <w:rFonts w:ascii="Open Sans" w:hAnsi="Open Sans" w:eastAsia="Open Sans" w:cs="Open Sans"/>
-                          <w:b w:val="0"/>
-                          <w:bCs w:val="0"/>
-                          <w:sz w:val="16"/>
-                          <w:szCs w:val="16"/>
-                        </w:rPr>
-                        <w:t xml:space="preserve">the sugi reach toward heaven</w:t>
-                      </w:r>
-                      <w:r/>
-                      <w:r>
-                        <w:rPr>
-                          <w:rFonts w:ascii="Open Sans" w:hAnsi="Open Sans" w:eastAsia="Open Sans" w:cs="Open Sans"/>
-                          <w:b w:val="0"/>
-                          <w:bCs w:val="0"/>
-                          <w:sz w:val="16"/>
-                          <w:szCs w:val="16"/>
-                        </w:rPr>
-                      </w:r>
-                      <w:r>
-                        <w:rPr>
-                          <w:rFonts w:ascii="Open Sans" w:hAnsi="Open Sans" w:eastAsia="Open Sans" w:cs="Open Sans"/>
-                          <w:b w:val="0"/>
-                          <w:bCs w:val="0"/>
-                          <w:sz w:val="16"/>
-                          <w:szCs w:val="16"/>
-                        </w:rPr>
-                      </w:r>
-                    </w:p>
-                    <w:p>
-                      <w:pPr>
-                        <w:pBdr/>
-                        <w:spacing w:after="0" w:afterAutospacing="0" w:line="235" w:lineRule="auto"/>
-                        <w:ind/>
-                        <w:rPr>
-                          <w:sz w:val="16"/>
-                          <w:szCs w:val="16"/>
-                        </w:rPr>
-                      </w:pPr>
-                      <w:r>
-                        <w:rPr>
-                          <w:rFonts w:ascii="Open Sans" w:hAnsi="Open Sans" w:eastAsia="Open Sans" w:cs="Open Sans"/>
-                          <w:b w:val="0"/>
-                          <w:bCs w:val="0"/>
-                          <w:sz w:val="16"/>
-                          <w:szCs w:val="16"/>
-                        </w:rPr>
-                        <w:t xml:space="preserve">and grow old.</w:t>
-                      </w:r>
-                      <w:r/>
-                      <w:r>
-                        <w:rPr>
-                          <w:rFonts w:ascii="Open Sans" w:hAnsi="Open Sans" w:eastAsia="Open Sans" w:cs="Open Sans"/>
-                          <w:b w:val="0"/>
-                          <w:bCs w:val="0"/>
-                          <w:sz w:val="16"/>
-                          <w:szCs w:val="16"/>
-                        </w:rPr>
-                      </w:r>
-                      <w:r>
-                        <w:rPr>
-                          <w:sz w:val="16"/>
-                          <w:szCs w:val="16"/>
-                        </w:rPr>
-                      </w:r>
-                      <w:r>
-                        <w:rPr>
-                          <w:sz w:val="16"/>
-                          <w:szCs w:val="16"/>
-                        </w:rPr>
-                      </w:r>
-                      <w:r>
-                        <w:rPr>
-                          <w:sz w:val="16"/>
-                          <w:szCs w:val="16"/>
-                        </w:rPr>
-                      </w:r>
-                    </w:p>
-                  </w:txbxContent>
-                </v:textbox>
-              </v:shape>
-            </w:pict>
-          </mc:Fallback>
-        </mc:AlternateContent>
-      </w:r>
-      <w:r/>
-      <w:r>
-        <mc:AlternateContent>
-          <mc:Choice Requires="wpg">
-            <w:drawing>
-              <wp:anchor xmlns:wp="http://schemas.openxmlformats.org/drawingml/2006/wordprocessingDrawing" xmlns:wp14="http://schemas.microsoft.com/office/word/2010/wordprocessingDrawing" distT="0" distB="0" distL="115200" distR="115200" simplePos="0" relativeHeight="11264" behindDoc="0" locked="0" layoutInCell="1" allowOverlap="1">
-                <wp:simplePos x="0" y="0"/>
-                <wp:positionH relativeFrom="column">
-                  <wp:posOffset>4205694</wp:posOffset>
-                </wp:positionH>
-                <wp:positionV relativeFrom="paragraph">
-                  <wp:posOffset>267436</wp:posOffset>
-                </wp:positionV>
-                <wp:extent cx="971550" cy="929664"/>
-                <wp:effectExtent l="3175" t="3175" r="3175" b="3175"/>
-                <wp:wrapNone/>
-                <wp:docPr id="8" name=""/>
-                <wp:cNvGraphicFramePr/>
-                <a:graphic xmlns:a="http://schemas.openxmlformats.org/drawingml/2006/main">
-                  <a:graphicData uri="http://schemas.microsoft.com/office/word/2010/wordprocessingShape">
-                    <wps:wsp>
-                      <wps:cNvPr id="1963922035" name=""/>
-                      <wps:cNvSpPr txBox="1"/>
-                      <wps:spPr bwMode="auto">
-                        <a:xfrm rot="0" flipH="0" flipV="0">
-                          <a:off x="0" y="0"/>
-                          <a:ext cx="971550" cy="929664"/>
-                        </a:xfrm>
-                        <a:prstGeom prst="rect">
-                          <a:avLst/>
-                        </a:prstGeom>
-                        <a:noFill/>
-                        <a:ln w="6350">
-                          <a:noFill/>
-                        </a:ln>
-                      </wps:spPr>
-                      <wps:txbx>
-                        <w:txbxContent>
-                          <w:p>
-                            <w:pPr>
-                              <w:pBdr/>
-                              <w:spacing w:after="0" w:afterAutospacing="0" w:line="235" w:lineRule="auto"/>
-                              <w:ind/>
-                              <w:rPr>
-                                <w:rFonts w:ascii="Open Sans" w:hAnsi="Open Sans" w:eastAsia="Open Sans" w:cs="Open Sans"/>
-                                <w:b w:val="0"/>
-                                <w:bCs w:val="0"/>
-                                <w:sz w:val="16"/>
-                                <w:szCs w:val="16"/>
-                              </w:rPr>
-                            </w:pPr>
-                            <w:r>
-                              <w:rPr>
-                                <w:rFonts w:ascii="Open Sans" w:hAnsi="Open Sans" w:eastAsia="Open Sans" w:cs="Open Sans"/>
-                                <w:b w:val="0"/>
-                                <w:bCs w:val="0"/>
-                                <w:sz w:val="16"/>
-                                <w:szCs w:val="16"/>
-                              </w:rPr>
-                              <w:t xml:space="preserve">For lives far away,</w:t>
-                            </w:r>
-                            <w:r/>
-                            <w:r>
-                              <w:rPr>
-                                <w:rFonts w:ascii="Open Sans" w:hAnsi="Open Sans" w:eastAsia="Open Sans" w:cs="Open Sans"/>
-                                <w:b w:val="0"/>
-                                <w:bCs w:val="0"/>
-                                <w:sz w:val="16"/>
-                                <w:szCs w:val="16"/>
-                              </w:rPr>
-                            </w:r>
-                            <w:r>
-                              <w:rPr>
-                                <w:rFonts w:ascii="Open Sans" w:hAnsi="Open Sans" w:eastAsia="Open Sans" w:cs="Open Sans"/>
-                                <w:b w:val="0"/>
-                                <w:bCs w:val="0"/>
-                                <w:sz w:val="16"/>
-                                <w:szCs w:val="16"/>
-                              </w:rPr>
-                            </w:r>
-                          </w:p>
-                          <w:p>
-                            <w:pPr>
-                              <w:pBdr/>
-                              <w:spacing w:after="0" w:afterAutospacing="0" w:line="235" w:lineRule="auto"/>
-                              <w:ind/>
-                              <w:rPr>
-                                <w:rFonts w:ascii="Open Sans" w:hAnsi="Open Sans" w:eastAsia="Open Sans" w:cs="Open Sans"/>
-                                <w:b w:val="0"/>
-                                <w:bCs w:val="0"/>
-                                <w:sz w:val="16"/>
-                                <w:szCs w:val="16"/>
-                              </w:rPr>
-                            </w:pPr>
-                            <w:r>
-                              <w:rPr>
-                                <w:rFonts w:ascii="Open Sans" w:hAnsi="Open Sans" w:eastAsia="Open Sans" w:cs="Open Sans"/>
-                                <w:b w:val="0"/>
-                                <w:bCs w:val="0"/>
-                                <w:sz w:val="16"/>
-                                <w:szCs w:val="16"/>
-                              </w:rPr>
-                              <w:t xml:space="preserve">the warmth of human hands</w:t>
-                            </w:r>
-                            <w:r/>
-                            <w:r>
-                              <w:rPr>
-                                <w:rFonts w:ascii="Open Sans" w:hAnsi="Open Sans" w:eastAsia="Open Sans" w:cs="Open Sans"/>
-                                <w:b w:val="0"/>
-                                <w:bCs w:val="0"/>
-                                <w:sz w:val="16"/>
-                                <w:szCs w:val="16"/>
-                              </w:rPr>
-                            </w:r>
-                            <w:r>
-                              <w:rPr>
-                                <w:rFonts w:ascii="Open Sans" w:hAnsi="Open Sans" w:eastAsia="Open Sans" w:cs="Open Sans"/>
-                                <w:b w:val="0"/>
-                                <w:bCs w:val="0"/>
-                                <w:sz w:val="16"/>
-                                <w:szCs w:val="16"/>
-                              </w:rPr>
-                            </w:r>
-                          </w:p>
-                          <w:p>
-                            <w:pPr>
-                              <w:pBdr/>
-                              <w:spacing w:after="0" w:afterAutospacing="0" w:line="235" w:lineRule="auto"/>
-                              <w:ind/>
-                              <w:rPr>
-                                <w:rFonts w:ascii="Open Sans" w:hAnsi="Open Sans" w:eastAsia="Open Sans" w:cs="Open Sans"/>
-                                <w:b w:val="0"/>
-                                <w:bCs w:val="0"/>
-                                <w:sz w:val="16"/>
-                                <w:szCs w:val="16"/>
-                              </w:rPr>
-                            </w:pPr>
-                            <w:r>
-                              <w:rPr>
-                                <w:rFonts w:ascii="Open Sans" w:hAnsi="Open Sans" w:eastAsia="Open Sans" w:cs="Open Sans"/>
-                                <w:b w:val="0"/>
-                                <w:bCs w:val="0"/>
-                                <w:sz w:val="16"/>
-                                <w:szCs w:val="16"/>
-                              </w:rPr>
-                              <w:t xml:space="preserve">remains.</w:t>
-                            </w:r>
-                            <w:r/>
-                            <w:r>
-                              <w:rPr>
-                                <w:rFonts w:ascii="Open Sans" w:hAnsi="Open Sans" w:eastAsia="Open Sans" w:cs="Open Sans"/>
-                                <w:b w:val="0"/>
-                                <w:bCs w:val="0"/>
-                                <w:sz w:val="16"/>
-                                <w:szCs w:val="16"/>
-                              </w:rPr>
-                            </w:r>
-                            <w:r>
-                              <w:rPr>
-                                <w:rFonts w:ascii="Open Sans" w:hAnsi="Open Sans" w:eastAsia="Open Sans" w:cs="Open Sans"/>
-                                <w:b w:val="0"/>
-                                <w:bCs w:val="0"/>
-                                <w:sz w:val="16"/>
-                                <w:szCs w:val="16"/>
-                              </w:rPr>
-                            </w:r>
-                            <w:r>
-                              <w:rPr>
-                                <w:rFonts w:ascii="Open Sans" w:hAnsi="Open Sans" w:eastAsia="Open Sans" w:cs="Open Sans"/>
-                                <w:b w:val="0"/>
-                                <w:bCs w:val="0"/>
-                                <w:sz w:val="16"/>
-                                <w:szCs w:val="16"/>
-                              </w:rPr>
-                            </w:r>
-                            <w:r>
-                              <w:rPr>
-                                <w:rFonts w:ascii="Open Sans" w:hAnsi="Open Sans" w:eastAsia="Open Sans" w:cs="Open Sans"/>
-                                <w:b w:val="0"/>
-                                <w:bCs w:val="0"/>
-                                <w:sz w:val="16"/>
-                                <w:szCs w:val="16"/>
-                              </w:rPr>
-                            </w:r>
-                          </w:p>
-                        </w:txbxContent>
-                      </wps:txbx>
-                      <wps:bodyPr vertOverflow="overflow" horzOverflow="overflow" vert="horz" wrap="square" lIns="91440" tIns="45720" rIns="91440" bIns="45720" numCol="1" spcCol="0" rtlCol="0" fromWordArt="0" anchor="t" anchorCtr="0" forceAA="0" upright="0" compatLnSpc="0"/>
-                    </wps:wsp>
-                  </a:graphicData>
-                </a:graphic>
-              </wp:anchor>
-            </w:drawing>
-          </mc:Choice>
-          <mc:Fallback>
-            <w:pict>
-              <v:shape id="shape 7" o:spid="_x0000_s7" o:spt="202" type="#_x0000_t202" style="position:absolute;z-index:11264;o:allowoverlap:true;o:allowincell:true;mso-position-horizontal-relative:text;margin-left:331.16pt;mso-position-horizontal:absolute;mso-position-vertical-relative:text;margin-top:21.06pt;mso-position-vertical:absolute;width:76.50pt;height:73.20pt;mso-wrap-distance-left:9.07pt;mso-wrap-distance-top:0.00pt;mso-wrap-distance-right:9.07pt;mso-wrap-distance-bottom:0.00pt;rotation:0;v-text-anchor:top;visibility:visible;" filled="f" stroked="f" strokeweight="0.50pt">
-                <v:textbox inset="0,0,0,0">
-                  <w:txbxContent>
-                    <w:p>
-                      <w:pPr>
-                        <w:pBdr/>
-                        <w:spacing w:after="0" w:afterAutospacing="0" w:line="235" w:lineRule="auto"/>
-                        <w:ind/>
-                        <w:rPr>
-                          <w:rFonts w:ascii="Open Sans" w:hAnsi="Open Sans" w:eastAsia="Open Sans" w:cs="Open Sans"/>
-                          <w:b w:val="0"/>
-                          <w:bCs w:val="0"/>
-                          <w:sz w:val="16"/>
-                          <w:szCs w:val="16"/>
-                        </w:rPr>
-                      </w:pPr>
-                      <w:r>
-                        <w:rPr>
-                          <w:rFonts w:ascii="Open Sans" w:hAnsi="Open Sans" w:eastAsia="Open Sans" w:cs="Open Sans"/>
-                          <w:b w:val="0"/>
-                          <w:bCs w:val="0"/>
-                          <w:sz w:val="16"/>
-                          <w:szCs w:val="16"/>
-                        </w:rPr>
-                        <w:t xml:space="preserve">For lives far away,</w:t>
-                      </w:r>
-                      <w:r/>
-                      <w:r>
-                        <w:rPr>
-                          <w:rFonts w:ascii="Open Sans" w:hAnsi="Open Sans" w:eastAsia="Open Sans" w:cs="Open Sans"/>
-                          <w:b w:val="0"/>
-                          <w:bCs w:val="0"/>
-                          <w:sz w:val="16"/>
-                          <w:szCs w:val="16"/>
-                        </w:rPr>
-                      </w:r>
-                      <w:r>
-                        <w:rPr>
-                          <w:rFonts w:ascii="Open Sans" w:hAnsi="Open Sans" w:eastAsia="Open Sans" w:cs="Open Sans"/>
-                          <w:b w:val="0"/>
-                          <w:bCs w:val="0"/>
-                          <w:sz w:val="16"/>
-                          <w:szCs w:val="16"/>
-                        </w:rPr>
-                      </w:r>
-                    </w:p>
-                    <w:p>
-                      <w:pPr>
-                        <w:pBdr/>
-                        <w:spacing w:after="0" w:afterAutospacing="0" w:line="235" w:lineRule="auto"/>
-                        <w:ind/>
-                        <w:rPr>
-                          <w:rFonts w:ascii="Open Sans" w:hAnsi="Open Sans" w:eastAsia="Open Sans" w:cs="Open Sans"/>
-                          <w:b w:val="0"/>
-                          <w:bCs w:val="0"/>
-                          <w:sz w:val="16"/>
-                          <w:szCs w:val="16"/>
-                        </w:rPr>
-                      </w:pPr>
-                      <w:r>
-                        <w:rPr>
-                          <w:rFonts w:ascii="Open Sans" w:hAnsi="Open Sans" w:eastAsia="Open Sans" w:cs="Open Sans"/>
-                          <w:b w:val="0"/>
-                          <w:bCs w:val="0"/>
-                          <w:sz w:val="16"/>
-                          <w:szCs w:val="16"/>
-                        </w:rPr>
-                        <w:t xml:space="preserve">the warmth of human hands</w:t>
-                      </w:r>
-                      <w:r/>
-                      <w:r>
-                        <w:rPr>
-                          <w:rFonts w:ascii="Open Sans" w:hAnsi="Open Sans" w:eastAsia="Open Sans" w:cs="Open Sans"/>
-                          <w:b w:val="0"/>
-                          <w:bCs w:val="0"/>
-                          <w:sz w:val="16"/>
-                          <w:szCs w:val="16"/>
-                        </w:rPr>
-                      </w:r>
-                      <w:r>
-                        <w:rPr>
-                          <w:rFonts w:ascii="Open Sans" w:hAnsi="Open Sans" w:eastAsia="Open Sans" w:cs="Open Sans"/>
-                          <w:b w:val="0"/>
-                          <w:bCs w:val="0"/>
-                          <w:sz w:val="16"/>
-                          <w:szCs w:val="16"/>
-                        </w:rPr>
-                      </w:r>
-                    </w:p>
-                    <w:p>
-                      <w:pPr>
-                        <w:pBdr/>
-                        <w:spacing w:after="0" w:afterAutospacing="0" w:line="235" w:lineRule="auto"/>
-                        <w:ind/>
-                        <w:rPr>
-                          <w:rFonts w:ascii="Open Sans" w:hAnsi="Open Sans" w:eastAsia="Open Sans" w:cs="Open Sans"/>
-                          <w:b w:val="0"/>
-                          <w:bCs w:val="0"/>
-                          <w:sz w:val="16"/>
-                          <w:szCs w:val="16"/>
-                        </w:rPr>
-                      </w:pPr>
-                      <w:r>
-                        <w:rPr>
-                          <w:rFonts w:ascii="Open Sans" w:hAnsi="Open Sans" w:eastAsia="Open Sans" w:cs="Open Sans"/>
-                          <w:b w:val="0"/>
-                          <w:bCs w:val="0"/>
-                          <w:sz w:val="16"/>
-                          <w:szCs w:val="16"/>
-                        </w:rPr>
-                        <w:t xml:space="preserve">remains.</w:t>
-                      </w:r>
-                      <w:r/>
-                      <w:r>
-                        <w:rPr>
-                          <w:rFonts w:ascii="Open Sans" w:hAnsi="Open Sans" w:eastAsia="Open Sans" w:cs="Open Sans"/>
-                          <w:b w:val="0"/>
-                          <w:bCs w:val="0"/>
-                          <w:sz w:val="16"/>
-                          <w:szCs w:val="16"/>
-                        </w:rPr>
-                      </w:r>
-                      <w:r>
-                        <w:rPr>
-                          <w:rFonts w:ascii="Open Sans" w:hAnsi="Open Sans" w:eastAsia="Open Sans" w:cs="Open Sans"/>
-                          <w:b w:val="0"/>
-                          <w:bCs w:val="0"/>
-                          <w:sz w:val="16"/>
-                          <w:szCs w:val="16"/>
-                        </w:rPr>
-                      </w:r>
-                      <w:r>
-                        <w:rPr>
-                          <w:rFonts w:ascii="Open Sans" w:hAnsi="Open Sans" w:eastAsia="Open Sans" w:cs="Open Sans"/>
-                          <w:b w:val="0"/>
-                          <w:bCs w:val="0"/>
-                          <w:sz w:val="16"/>
-                          <w:szCs w:val="16"/>
-                        </w:rPr>
-                      </w:r>
-                      <w:r>
-                        <w:rPr>
-                          <w:rFonts w:ascii="Open Sans" w:hAnsi="Open Sans" w:eastAsia="Open Sans" w:cs="Open Sans"/>
-                          <w:b w:val="0"/>
-                          <w:bCs w:val="0"/>
-                          <w:sz w:val="16"/>
-                          <w:szCs w:val="16"/>
-                        </w:rPr>
-                      </w:r>
-                    </w:p>
-                  </w:txbxContent>
-                </v:textbox>
-              </v:shape>
-            </w:pict>
-          </mc:Fallback>
-        </mc:AlternateContent>
-      </w:r>
-      <w:r/>
-      <w:r>
-        <mc:AlternateContent>
-          <mc:Choice Requires="wpg">
-            <w:drawing>
-              <wp:anchor xmlns:wp="http://schemas.openxmlformats.org/drawingml/2006/wordprocessingDrawing" xmlns:wp14="http://schemas.microsoft.com/office/word/2010/wordprocessingDrawing" distT="0" distB="0" distL="115200" distR="115200" simplePos="0" relativeHeight="11264" behindDoc="0" locked="0" layoutInCell="1" allowOverlap="1">
-                <wp:simplePos x="0" y="0"/>
-                <wp:positionH relativeFrom="column">
-                  <wp:posOffset>5291544</wp:posOffset>
-                </wp:positionH>
-                <wp:positionV relativeFrom="paragraph">
-                  <wp:posOffset>267436</wp:posOffset>
-                </wp:positionV>
-                <wp:extent cx="985917" cy="1520700"/>
-                <wp:effectExtent l="3175" t="3175" r="3175" b="3175"/>
-                <wp:wrapNone/>
-                <wp:docPr id="9" name=""/>
-                <wp:cNvGraphicFramePr/>
-                <a:graphic xmlns:a="http://schemas.openxmlformats.org/drawingml/2006/main">
-                  <a:graphicData uri="http://schemas.microsoft.com/office/word/2010/wordprocessingShape">
-                    <wps:wsp>
-                      <wps:cNvPr id="1849561883" name=""/>
-                      <wps:cNvSpPr txBox="1"/>
-                      <wps:spPr bwMode="auto">
-                        <a:xfrm rot="0" flipH="0" flipV="0">
-                          <a:off x="0" y="0"/>
-                          <a:ext cx="985916" cy="1520699"/>
-                        </a:xfrm>
-                        <a:prstGeom prst="rect">
-                          <a:avLst/>
-                        </a:prstGeom>
-                        <a:noFill/>
-                        <a:ln w="6350">
-                          <a:noFill/>
-                        </a:ln>
-                      </wps:spPr>
-                      <wps:txbx>
-                        <w:txbxContent>
-                          <w:p>
-                            <w:pPr>
-                              <w:pBdr/>
-                              <w:spacing w:after="0" w:afterAutospacing="0" w:line="235" w:lineRule="auto"/>
-                              <w:ind/>
-                              <w:rPr>
-                                <w:rFonts w:ascii="Open Sans" w:hAnsi="Open Sans" w:eastAsia="Open Sans" w:cs="Open Sans"/>
-                                <w:b w:val="0"/>
-                                <w:bCs w:val="0"/>
-                                <w:sz w:val="16"/>
-                                <w:szCs w:val="16"/>
-                              </w:rPr>
-                            </w:pPr>
-                            <w:r>
-                              <w:rPr>
-                                <w:rFonts w:ascii="Open Sans" w:hAnsi="Open Sans" w:eastAsia="Open Sans" w:cs="Open Sans"/>
-                                <w:b w:val="0"/>
-                                <w:bCs w:val="0"/>
-                                <w:sz w:val="16"/>
-                                <w:szCs w:val="16"/>
-                              </w:rPr>
-                              <w:t xml:space="preserve">For their children's homes,</w:t>
-                            </w:r>
-                            <w:r/>
-                            <w:r>
-                              <w:rPr>
-                                <w:rFonts w:ascii="Open Sans" w:hAnsi="Open Sans" w:eastAsia="Open Sans" w:cs="Open Sans"/>
-                                <w:b w:val="0"/>
-                                <w:bCs w:val="0"/>
-                                <w:sz w:val="16"/>
-                                <w:szCs w:val="16"/>
-                              </w:rPr>
-                            </w:r>
-                            <w:r>
-                              <w:rPr>
-                                <w:rFonts w:ascii="Open Sans" w:hAnsi="Open Sans" w:eastAsia="Open Sans" w:cs="Open Sans"/>
-                                <w:b w:val="0"/>
-                                <w:bCs w:val="0"/>
-                                <w:sz w:val="16"/>
-                                <w:szCs w:val="16"/>
-                              </w:rPr>
-                            </w:r>
-                          </w:p>
-                          <w:p>
-                            <w:pPr>
-                              <w:pBdr/>
-                              <w:spacing w:after="0" w:afterAutospacing="0" w:line="235" w:lineRule="auto"/>
-                              <w:ind/>
-                              <w:rPr>
-                                <w:rFonts w:ascii="Open Sans" w:hAnsi="Open Sans" w:eastAsia="Open Sans" w:cs="Open Sans"/>
-                                <w:b w:val="0"/>
-                                <w:bCs w:val="0"/>
-                                <w:sz w:val="16"/>
-                                <w:szCs w:val="16"/>
-                              </w:rPr>
-                            </w:pPr>
-                            <w:r>
-                              <w:rPr>
-                                <w:rFonts w:ascii="Open Sans" w:hAnsi="Open Sans" w:eastAsia="Open Sans" w:cs="Open Sans"/>
-                                <w:b w:val="0"/>
-                                <w:bCs w:val="0"/>
-                                <w:sz w:val="16"/>
-                                <w:szCs w:val="16"/>
-                              </w:rPr>
-                              <w:t xml:space="preserve">sugi saplings enter the earth</w:t>
-                            </w:r>
-                            <w:r/>
                             <w:r>
                               <w:rPr>
                                 <w:rFonts w:ascii="Open Sans" w:hAnsi="Open Sans" w:eastAsia="Open Sans" w:cs="Open Sans"/>
@@ -2135,17 +2187,7 @@
                                 <w:sz w:val="16"/>
                                 <w:szCs w:val="16"/>
                               </w:rPr>
-                              <w:t xml:space="preserve">in the spring.</w:t>
-                            </w:r>
-                            <w:r/>
-                            <w:r>
-                              <w:rPr>
-                                <w:rFonts w:ascii="Open Sans" w:hAnsi="Open Sans" w:eastAsia="Open Sans" w:cs="Open Sans"/>
-                                <w:b w:val="0"/>
-                                <w:bCs w:val="0"/>
-                                <w:sz w:val="16"/>
-                                <w:szCs w:val="16"/>
-                              </w:rPr>
+                              <w:t xml:space="preserve">there are roots.</w:t>
                             </w:r>
                             <w:r>
                               <w:rPr>
@@ -2186,7 +2228,7 @@
           </mc:Choice>
           <mc:Fallback>
             <w:pict>
-              <v:shape id="shape 8" o:spid="_x0000_s8" o:spt="202" type="#_x0000_t202" style="position:absolute;z-index:11264;o:allowoverlap:true;o:allowincell:true;mso-position-horizontal-relative:text;margin-left:416.66pt;mso-position-horizontal:absolute;mso-position-vertical-relative:text;margin-top:21.06pt;mso-position-vertical:absolute;width:77.63pt;height:119.74pt;mso-wrap-distance-left:9.07pt;mso-wrap-distance-top:0.00pt;mso-wrap-distance-right:9.07pt;mso-wrap-distance-bottom:0.00pt;rotation:0;v-text-anchor:top;visibility:visible;" filled="f" stroked="f" strokeweight="0.50pt">
+              <v:shape id="shape 8" o:spid="_x0000_s8" o:spt="202" type="#_x0000_t202" style="position:absolute;z-index:11264;o:allowoverlap:true;o:allowincell:true;mso-position-horizontal-relative:text;margin-left:-55.31pt;mso-position-horizontal:absolute;mso-position-vertical-relative:text;margin-top:12.73pt;mso-position-vertical:absolute;width:62.37pt;height:73.20pt;mso-wrap-distance-left:9.07pt;mso-wrap-distance-top:0.00pt;mso-wrap-distance-right:9.07pt;mso-wrap-distance-bottom:0.00pt;rotation:0;v-text-anchor:top;visibility:visible;" filled="f" stroked="f" strokeweight="0.50pt">
                 <v:textbox inset="0,0,0,0">
                   <w:txbxContent>
                     <w:p>
@@ -2210,17 +2252,7 @@
                           <w:sz w:val="16"/>
                           <w:szCs w:val="16"/>
                         </w:rPr>
-                        <w:t xml:space="preserve">For their children's homes,</w:t>
-                      </w:r>
-                      <w:r/>
-                      <w:r>
-                        <w:rPr>
-                          <w:rFonts w:ascii="Open Sans" w:hAnsi="Open Sans" w:eastAsia="Open Sans" w:cs="Open Sans"/>
-                          <w:b w:val="0"/>
-                          <w:bCs w:val="0"/>
-                          <w:sz w:val="16"/>
-                          <w:szCs w:val="16"/>
-                        </w:rPr>
+                        <w:t xml:space="preserve">Deeper than human dreams,</w:t>
                       </w:r>
                       <w:r>
                         <w:rPr>
@@ -2231,31 +2263,6 @@
                           <w:szCs w:val="16"/>
                         </w:rPr>
                       </w:r>
-                    </w:p>
-                    <w:p>
-                      <w:pPr>
-                        <w:pBdr/>
-                        <w:spacing w:after="0" w:afterAutospacing="0" w:line="235" w:lineRule="auto"/>
-                        <w:ind/>
-                        <w:rPr>
-                          <w:rFonts w:ascii="Open Sans" w:hAnsi="Open Sans" w:eastAsia="Open Sans" w:cs="Open Sans"/>
-                          <w:b w:val="0"/>
-                          <w:bCs w:val="0"/>
-                          <w:sz w:val="16"/>
-                          <w:szCs w:val="16"/>
-                        </w:rPr>
-                      </w:pPr>
-                      <w:r>
-                        <w:rPr>
-                          <w:rFonts w:ascii="Open Sans" w:hAnsi="Open Sans" w:eastAsia="Open Sans" w:cs="Open Sans"/>
-                          <w:b w:val="0"/>
-                          <w:bCs w:val="0"/>
-                          <w:sz w:val="16"/>
-                          <w:szCs w:val="16"/>
-                        </w:rPr>
-                        <w:t xml:space="preserve">sugi saplings enter the earth</w:t>
-                      </w:r>
-                      <w:r/>
                       <w:r>
                         <w:rPr>
                           <w:rFonts w:ascii="Open Sans" w:hAnsi="Open Sans" w:eastAsia="Open Sans" w:cs="Open Sans"/>
@@ -2296,17 +2303,7 @@
                           <w:sz w:val="16"/>
                           <w:szCs w:val="16"/>
                         </w:rPr>
-                        <w:t xml:space="preserve">in the spring.</w:t>
-                      </w:r>
-                      <w:r/>
-                      <w:r>
-                        <w:rPr>
-                          <w:rFonts w:ascii="Open Sans" w:hAnsi="Open Sans" w:eastAsia="Open Sans" w:cs="Open Sans"/>
-                          <w:b w:val="0"/>
-                          <w:bCs w:val="0"/>
-                          <w:sz w:val="16"/>
-                          <w:szCs w:val="16"/>
-                        </w:rPr>
+                        <w:t xml:space="preserve">there are roots.</w:t>
                       </w:r>
                       <w:r>
                         <w:rPr>
@@ -2345,10 +2342,14 @@
       </w:r>
       <w:r/>
       <w:r/>
-      <w:r/>
-      <w:r/>
-      <w:r/>
-      <w:r/>
+    </w:p>
+    <w:p>
+      <w:pPr>
+        <w:pBdr/>
+        <w:spacing/>
+        <w:ind/>
+        <w:rPr/>
+      </w:pPr>
       <w:r/>
       <w:r/>
     </w:p>
@@ -2359,13 +2360,6 @@
         <w:ind/>
         <w:rPr/>
       </w:pPr>
-      <w:r/>
-      <w:r/>
-      <w:r/>
-      <w:r/>
-      <w:r/>
-      <w:r/>
-      <w:r/>
       <w:r/>
       <w:r/>
       <w:r/>
@@ -2383,6 +2377,93 @@
       </w:pPr>
       <w:r/>
       <w:r/>
+    </w:p>
+    <w:p>
+      <w:pPr>
+        <w:pBdr/>
+        <w:spacing/>
+        <w:ind/>
+        <w:rPr/>
+      </w:pPr>
+      <w:r/>
+      <w:r>
+        <mc:AlternateContent>
+          <mc:Choice Requires="wpg">
+            <w:drawing>
+              <wp:anchor xmlns:wp="http://schemas.openxmlformats.org/drawingml/2006/wordprocessingDrawing" xmlns:wp14="http://schemas.microsoft.com/office/word/2010/wordprocessingDrawing" distT="0" distB="0" distL="115200" distR="115200" simplePos="0" relativeHeight="156672" behindDoc="1" locked="0" layoutInCell="1" allowOverlap="1">
+                <wp:simplePos x="0" y="0"/>
+                <wp:positionH relativeFrom="column">
+                  <wp:posOffset>-842742</wp:posOffset>
+                </wp:positionH>
+                <wp:positionV relativeFrom="paragraph">
+                  <wp:posOffset>97375</wp:posOffset>
+                </wp:positionV>
+                <wp:extent cx="7071439" cy="1844437"/>
+                <wp:effectExtent l="0" t="0" r="0" b="0"/>
+                <wp:wrapNone/>
+                <wp:docPr id="10" name=""/>
+                <wp:cNvGraphicFramePr>
+                  <a:graphicFrameLocks xmlns:a="http://schemas.openxmlformats.org/drawingml/2006/main" noChangeAspect="1"/>
+                </wp:cNvGraphicFramePr>
+                <a:graphic xmlns:a="http://schemas.openxmlformats.org/drawingml/2006/main">
+                  <a:graphicData uri="http://schemas.openxmlformats.org/drawingml/2006/picture">
+                    <pic:pic xmlns:pic="http://schemas.openxmlformats.org/drawingml/2006/picture">
+                      <pic:nvPicPr>
+                        <pic:cNvPr id="151675339" name=""/>
+                        <pic:cNvPicPr>
+                          <a:picLocks noChangeAspect="1"/>
+                        </pic:cNvPicPr>
+                        <pic:nvPr/>
+                      </pic:nvPicPr>
+                      <pic:blipFill rotWithShape="1">
+                        <a:blip r:embed="rId10"/>
+                        <a:stretch/>
+                      </pic:blipFill>
+                      <pic:spPr bwMode="auto">
+                        <a:xfrm flipH="0" flipV="0">
+                          <a:off x="0" y="0"/>
+                          <a:ext cx="7071439" cy="1844436"/>
+                        </a:xfrm>
+                        <a:prstGeom prst="rect">
+                          <a:avLst/>
+                        </a:prstGeom>
+                      </pic:spPr>
+                    </pic:pic>
+                  </a:graphicData>
+                </a:graphic>
+              </wp:anchor>
+            </w:drawing>
+          </mc:Choice>
+          <mc:Fallback>
+            <w:pict>
+              <v:shapetype id="_x0000_t75" coordsize="21600,21600" o:spt="75" o:preferrelative="t" path="m@4@5l@4@11@9@11@9@5xe" filled="f" stroked="f">
+                <v:stroke joinstyle="miter"/>
+                <v:formulas>
+                  <v:f eqn="if lineDrawn pixelLineWidth 0"/>
+                  <v:f eqn="sum @0 1 0"/>
+                  <v:f eqn="sum 0 0 @1"/>
+                  <v:f eqn="prod @2 1 2"/>
+                  <v:f eqn="prod @3 21600 pixelWidth"/>
+                  <v:f eqn="prod @3 21600 pixelHeight"/>
+                  <v:f eqn="sum @0 0 1"/>
+                  <v:f eqn="prod @6 1 2"/>
+                  <v:f eqn="prod @7 21600 pixelWidth"/>
+                  <v:f eqn="sum @8 21600 0"/>
+                  <v:f eqn="prod @7 21600 pixelHeight"/>
+                  <v:f eqn="sum @10 21600 0"/>
+                </v:formulas>
+                <v:path o:extrusionok="f" gradientshapeok="t" o:connecttype="rect"/>
+                <o:lock v:ext="edit" aspectratio="t"/>
+              </v:shapetype>
+              <v:shape id="_x0000_i9" o:spid="_x0000_s9" type="#_x0000_t75" style="position:absolute;z-index:-156672;o:allowoverlap:true;o:allowincell:true;mso-position-horizontal-relative:text;margin-left:-66.36pt;mso-position-horizontal:absolute;mso-position-vertical-relative:text;margin-top:7.67pt;mso-position-vertical:absolute;width:556.81pt;height:145.23pt;mso-wrap-distance-left:9.07pt;mso-wrap-distance-top:0.00pt;mso-wrap-distance-right:9.07pt;mso-wrap-distance-bottom:0.00pt;z-index:1;" stroked="false">
+                <v:imagedata r:id="rId10" o:title=""/>
+                <o:lock v:ext="edit" rotation="t"/>
+              </v:shape>
+            </w:pict>
+          </mc:Fallback>
+        </mc:AlternateContent>
+      </w:r>
+      <w:r/>
       <w:r/>
     </w:p>
     <w:p>
@@ -2392,7 +2473,6 @@
         <w:ind/>
         <w:rPr/>
       </w:pPr>
-      <w:r/>
       <w:r>
         <mc:AlternateContent>
           <mc:Choice Requires="wpg">
@@ -2400,15 +2480,15 @@
               <wp:anchor xmlns:wp="http://schemas.openxmlformats.org/drawingml/2006/wordprocessingDrawing" xmlns:wp14="http://schemas.microsoft.com/office/word/2010/wordprocessingDrawing" distT="0" distB="0" distL="115200" distR="115200" simplePos="0" relativeHeight="11264" behindDoc="0" locked="0" layoutInCell="1" allowOverlap="1">
                 <wp:simplePos x="0" y="0"/>
                 <wp:positionH relativeFrom="column">
-                  <wp:posOffset>5450662</wp:posOffset>
+                  <wp:posOffset>5443501</wp:posOffset>
                 </wp:positionH>
                 <wp:positionV relativeFrom="paragraph">
-                  <wp:posOffset>2875083</wp:posOffset>
+                  <wp:posOffset>1630074</wp:posOffset>
                 </wp:positionV>
                 <wp:extent cx="985917" cy="1568466"/>
                 <wp:effectExtent l="0" t="0" r="0" b="0"/>
                 <wp:wrapNone/>
-                <wp:docPr id="10" name=""/>
+                <wp:docPr id="11" name=""/>
                 <wp:cNvGraphicFramePr/>
                 <a:graphic xmlns:a="http://schemas.openxmlformats.org/drawingml/2006/main">
                   <a:graphicData uri="http://schemas.microsoft.com/office/word/2010/wordprocessingShape">
@@ -2491,10 +2571,9 @@
                               </w:rPr>
                               <w:t xml:space="preserve">becomes fire.</w:t>
                             </w:r>
-                            <w:r/>
                             <w:r>
                               <w:rPr>
-                                <w:rFonts w:ascii="Open Sans" w:hAnsi="Open Sans" w:eastAsia="Open Sans" w:cs="Open Sans"/>
+                                <w:rFonts w:ascii="Open Sans" w:hAnsi="Open Sans" w:cs="Open Sans"/>
                                 <w:b w:val="0"/>
                                 <w:bCs w:val="0"/>
                                 <w:sz w:val="16"/>
@@ -2522,7 +2601,7 @@
           </mc:Choice>
           <mc:Fallback>
             <w:pict>
-              <v:shape id="shape 9" o:spid="_x0000_s9" o:spt="202" type="#_x0000_t202" style="position:absolute;z-index:11264;o:allowoverlap:true;o:allowincell:true;mso-position-horizontal-relative:text;margin-left:429.19pt;mso-position-horizontal:absolute;mso-position-vertical-relative:text;margin-top:226.38pt;mso-position-vertical:absolute;width:77.63pt;height:123.50pt;mso-wrap-distance-left:9.07pt;mso-wrap-distance-top:0.00pt;mso-wrap-distance-right:9.07pt;mso-wrap-distance-bottom:0.00pt;rotation:0;v-text-anchor:top;visibility:visible;" filled="f" stroked="f" strokeweight="0.50pt">
+              <v:shape id="shape 10" o:spid="_x0000_s10" o:spt="202" type="#_x0000_t202" style="position:absolute;z-index:11264;o:allowoverlap:true;o:allowincell:true;mso-position-horizontal-relative:text;margin-left:428.62pt;mso-position-horizontal:absolute;mso-position-vertical-relative:text;margin-top:128.35pt;mso-position-vertical:absolute;width:77.63pt;height:123.50pt;mso-wrap-distance-left:9.07pt;mso-wrap-distance-top:0.00pt;mso-wrap-distance-right:9.07pt;mso-wrap-distance-bottom:0.00pt;rotation:0;v-text-anchor:top;visibility:visible;" filled="f" stroked="f" strokeweight="0.50pt">
                 <v:textbox inset="0,0,0,0">
                   <w:txbxContent>
                     <w:p>
@@ -2586,10 +2665,9 @@
                         </w:rPr>
                         <w:t xml:space="preserve">becomes fire.</w:t>
                       </w:r>
-                      <w:r/>
                       <w:r>
                         <w:rPr>
-                          <w:rFonts w:ascii="Open Sans" w:hAnsi="Open Sans" w:eastAsia="Open Sans" w:cs="Open Sans"/>
+                          <w:rFonts w:ascii="Open Sans" w:hAnsi="Open Sans" w:cs="Open Sans"/>
                           <w:b w:val="0"/>
                           <w:bCs w:val="0"/>
                           <w:sz w:val="16"/>
@@ -2613,7 +2691,6 @@
           </mc:Fallback>
         </mc:AlternateContent>
       </w:r>
-      <w:r/>
       <w:r>
         <mc:AlternateContent>
           <mc:Choice Requires="wpg">
@@ -2621,15 +2698,15 @@
               <wp:anchor xmlns:wp="http://schemas.openxmlformats.org/drawingml/2006/wordprocessingDrawing" xmlns:wp14="http://schemas.microsoft.com/office/word/2010/wordprocessingDrawing" distT="0" distB="0" distL="115200" distR="115200" simplePos="0" relativeHeight="11264" behindDoc="0" locked="0" layoutInCell="1" allowOverlap="1">
                 <wp:simplePos x="0" y="0"/>
                 <wp:positionH relativeFrom="column">
-                  <wp:posOffset>4364812</wp:posOffset>
+                  <wp:posOffset>4357651</wp:posOffset>
                 </wp:positionH>
                 <wp:positionV relativeFrom="paragraph">
-                  <wp:posOffset>2875083</wp:posOffset>
+                  <wp:posOffset>1630074</wp:posOffset>
                 </wp:positionV>
                 <wp:extent cx="971550" cy="958866"/>
                 <wp:effectExtent l="0" t="0" r="0" b="0"/>
                 <wp:wrapNone/>
-                <wp:docPr id="11" name=""/>
+                <wp:docPr id="12" name=""/>
                 <wp:cNvGraphicFramePr/>
                 <a:graphic xmlns:a="http://schemas.openxmlformats.org/drawingml/2006/main">
                   <a:graphicData uri="http://schemas.microsoft.com/office/word/2010/wordprocessingShape">
@@ -2712,7 +2789,6 @@
                               </w:rPr>
                               <w:t xml:space="preserve">into wisdom.</w:t>
                             </w:r>
-                            <w:r/>
                             <w:r>
                               <w:rPr>
                                 <w:rFonts w:ascii="Open Sans" w:hAnsi="Open Sans" w:eastAsia="Open Sans" w:cs="Open Sans"/>
@@ -2743,7 +2819,7 @@
           </mc:Choice>
           <mc:Fallback>
             <w:pict>
-              <v:shape id="shape 10" o:spid="_x0000_s10" o:spt="202" type="#_x0000_t202" style="position:absolute;z-index:11264;o:allowoverlap:true;o:allowincell:true;mso-position-horizontal-relative:text;margin-left:343.69pt;mso-position-horizontal:absolute;mso-position-vertical-relative:text;margin-top:226.38pt;mso-position-vertical:absolute;width:76.50pt;height:75.50pt;mso-wrap-distance-left:9.07pt;mso-wrap-distance-top:0.00pt;mso-wrap-distance-right:9.07pt;mso-wrap-distance-bottom:0.00pt;rotation:0;v-text-anchor:top;visibility:visible;" filled="f" stroked="f" strokeweight="0.50pt">
+              <v:shape id="shape 11" o:spid="_x0000_s11" o:spt="202" type="#_x0000_t202" style="position:absolute;z-index:11264;o:allowoverlap:true;o:allowincell:true;mso-position-horizontal-relative:text;margin-left:343.12pt;mso-position-horizontal:absolute;mso-position-vertical-relative:text;margin-top:128.35pt;mso-position-vertical:absolute;width:76.50pt;height:75.50pt;mso-wrap-distance-left:9.07pt;mso-wrap-distance-top:0.00pt;mso-wrap-distance-right:9.07pt;mso-wrap-distance-bottom:0.00pt;rotation:0;v-text-anchor:top;visibility:visible;" filled="f" stroked="f" strokeweight="0.50pt">
                 <v:textbox inset="0,0,0,0">
                   <w:txbxContent>
                     <w:p>
@@ -2807,7 +2883,6 @@
                         </w:rPr>
                         <w:t xml:space="preserve">into wisdom.</w:t>
                       </w:r>
-                      <w:r/>
                       <w:r>
                         <w:rPr>
                           <w:rFonts w:ascii="Open Sans" w:hAnsi="Open Sans" w:eastAsia="Open Sans" w:cs="Open Sans"/>
@@ -2834,7 +2909,6 @@
           </mc:Fallback>
         </mc:AlternateContent>
       </w:r>
-      <w:r/>
       <w:r>
         <mc:AlternateContent>
           <mc:Choice Requires="wpg">
@@ -2842,15 +2916,15 @@
               <wp:anchor xmlns:wp="http://schemas.openxmlformats.org/drawingml/2006/wordprocessingDrawing" xmlns:wp14="http://schemas.microsoft.com/office/word/2010/wordprocessingDrawing" distT="0" distB="0" distL="115200" distR="115200" simplePos="0" relativeHeight="11264" behindDoc="0" locked="0" layoutInCell="1" allowOverlap="1">
                 <wp:simplePos x="0" y="0"/>
                 <wp:positionH relativeFrom="column">
-                  <wp:posOffset>2917354</wp:posOffset>
+                  <wp:posOffset>2910193</wp:posOffset>
                 </wp:positionH>
                 <wp:positionV relativeFrom="paragraph">
-                  <wp:posOffset>2875083</wp:posOffset>
+                  <wp:posOffset>1630074</wp:posOffset>
                 </wp:positionV>
                 <wp:extent cx="983700" cy="1661346"/>
                 <wp:effectExtent l="0" t="0" r="0" b="0"/>
                 <wp:wrapNone/>
-                <wp:docPr id="12" name=""/>
+                <wp:docPr id="13" name=""/>
                 <wp:cNvGraphicFramePr/>
                 <a:graphic xmlns:a="http://schemas.openxmlformats.org/drawingml/2006/main">
                   <a:graphicData uri="http://schemas.microsoft.com/office/word/2010/wordprocessingShape">
@@ -2930,12 +3004,8 @@
                               </w:rPr>
                               <w:t xml:space="preserve">within the heart of the forest.</w:t>
                             </w:r>
-                            <w:r/>
                             <w:r>
                               <w:rPr>
-                                <w:rFonts w:ascii="Open Sans" w:hAnsi="Open Sans" w:eastAsia="Open Sans" w:cs="Open Sans"/>
-                                <w:b w:val="0"/>
-                                <w:bCs w:val="0"/>
                                 <w:sz w:val="16"/>
                                 <w:szCs w:val="16"/>
                               </w:rPr>
@@ -2958,7 +3028,7 @@
           </mc:Choice>
           <mc:Fallback>
             <w:pict>
-              <v:shape id="shape 11" o:spid="_x0000_s11" o:spt="202" type="#_x0000_t202" style="position:absolute;z-index:11264;o:allowoverlap:true;o:allowincell:true;mso-position-horizontal-relative:text;margin-left:229.71pt;mso-position-horizontal:absolute;mso-position-vertical-relative:text;margin-top:226.38pt;mso-position-vertical:absolute;width:77.46pt;height:130.81pt;mso-wrap-distance-left:9.07pt;mso-wrap-distance-top:0.00pt;mso-wrap-distance-right:9.07pt;mso-wrap-distance-bottom:0.00pt;rotation:0;v-text-anchor:top;visibility:visible;" filled="f" stroked="f" strokeweight="0.50pt">
+              <v:shape id="shape 12" o:spid="_x0000_s12" o:spt="202" type="#_x0000_t202" style="position:absolute;z-index:11264;o:allowoverlap:true;o:allowincell:true;mso-position-horizontal-relative:text;margin-left:229.15pt;mso-position-horizontal:absolute;mso-position-vertical-relative:text;margin-top:128.35pt;mso-position-vertical:absolute;width:77.46pt;height:130.81pt;mso-wrap-distance-left:9.07pt;mso-wrap-distance-top:0.00pt;mso-wrap-distance-right:9.07pt;mso-wrap-distance-bottom:0.00pt;rotation:0;v-text-anchor:top;visibility:visible;" filled="f" stroked="f" strokeweight="0.50pt">
                 <v:textbox inset="0,0,0,0">
                   <w:txbxContent>
                     <w:p>
@@ -3019,12 +3089,8 @@
                         </w:rPr>
                         <w:t xml:space="preserve">within the heart of the forest.</w:t>
                       </w:r>
-                      <w:r/>
                       <w:r>
                         <w:rPr>
-                          <w:rFonts w:ascii="Open Sans" w:hAnsi="Open Sans" w:eastAsia="Open Sans" w:cs="Open Sans"/>
-                          <w:b w:val="0"/>
-                          <w:bCs w:val="0"/>
                           <w:sz w:val="16"/>
                           <w:szCs w:val="16"/>
                         </w:rPr>
@@ -3043,7 +3109,6 @@
           </mc:Fallback>
         </mc:AlternateContent>
       </w:r>
-      <w:r/>
       <w:r>
         <mc:AlternateContent>
           <mc:Choice Requires="wpg">
@@ -3051,15 +3116,15 @@
               <wp:anchor xmlns:wp="http://schemas.openxmlformats.org/drawingml/2006/wordprocessingDrawing" xmlns:wp14="http://schemas.microsoft.com/office/word/2010/wordprocessingDrawing" distT="0" distB="0" distL="115200" distR="115200" simplePos="0" relativeHeight="11264" behindDoc="0" locked="0" layoutInCell="1" allowOverlap="1">
                 <wp:simplePos x="0" y="0"/>
                 <wp:positionH relativeFrom="column">
-                  <wp:posOffset>1925577</wp:posOffset>
+                  <wp:posOffset>1918416</wp:posOffset>
                 </wp:positionH>
                 <wp:positionV relativeFrom="paragraph">
-                  <wp:posOffset>2875083</wp:posOffset>
+                  <wp:posOffset>1630074</wp:posOffset>
                 </wp:positionV>
                 <wp:extent cx="734260" cy="1062499"/>
                 <wp:effectExtent l="0" t="0" r="0" b="0"/>
                 <wp:wrapNone/>
-                <wp:docPr id="13" name=""/>
+                <wp:docPr id="14" name=""/>
                 <wp:cNvGraphicFramePr/>
                 <a:graphic xmlns:a="http://schemas.openxmlformats.org/drawingml/2006/main">
                   <a:graphicData uri="http://schemas.microsoft.com/office/word/2010/wordprocessingShape">
@@ -3142,10 +3207,9 @@
                               </w:rPr>
                               <w:t xml:space="preserve">into countless dreams.</w:t>
                             </w:r>
-                            <w:r/>
                             <w:r>
                               <w:rPr>
-                                <w:rFonts w:ascii="Open Sans" w:hAnsi="Open Sans" w:eastAsia="Open Sans" w:cs="Open Sans"/>
+                                <w:rFonts w:ascii="Open Sans" w:hAnsi="Open Sans" w:cs="Open Sans"/>
                                 <w:b w:val="0"/>
                                 <w:bCs w:val="0"/>
                                 <w:sz w:val="16"/>
@@ -3173,7 +3237,7 @@
           </mc:Choice>
           <mc:Fallback>
             <w:pict>
-              <v:shape id="shape 12" o:spid="_x0000_s12" o:spt="202" type="#_x0000_t202" style="position:absolute;z-index:11264;o:allowoverlap:true;o:allowincell:true;mso-position-horizontal-relative:text;margin-left:151.62pt;mso-position-horizontal:absolute;mso-position-vertical-relative:text;margin-top:226.38pt;mso-position-vertical:absolute;width:57.82pt;height:83.66pt;mso-wrap-distance-left:9.07pt;mso-wrap-distance-top:0.00pt;mso-wrap-distance-right:9.07pt;mso-wrap-distance-bottom:0.00pt;rotation:0;v-text-anchor:top;visibility:visible;" filled="f" stroked="f" strokeweight="0.50pt">
+              <v:shape id="shape 13" o:spid="_x0000_s13" o:spt="202" type="#_x0000_t202" style="position:absolute;z-index:11264;o:allowoverlap:true;o:allowincell:true;mso-position-horizontal-relative:text;margin-left:151.06pt;mso-position-horizontal:absolute;mso-position-vertical-relative:text;margin-top:128.35pt;mso-position-vertical:absolute;width:57.82pt;height:83.66pt;mso-wrap-distance-left:9.07pt;mso-wrap-distance-top:0.00pt;mso-wrap-distance-right:9.07pt;mso-wrap-distance-bottom:0.00pt;rotation:0;v-text-anchor:top;visibility:visible;" filled="f" stroked="f" strokeweight="0.50pt">
                 <v:textbox inset="0,0,0,0">
                   <w:txbxContent>
                     <w:p>
@@ -3237,10 +3301,9 @@
                         </w:rPr>
                         <w:t xml:space="preserve">into countless dreams.</w:t>
                       </w:r>
-                      <w:r/>
                       <w:r>
                         <w:rPr>
-                          <w:rFonts w:ascii="Open Sans" w:hAnsi="Open Sans" w:eastAsia="Open Sans" w:cs="Open Sans"/>
+                          <w:rFonts w:ascii="Open Sans" w:hAnsi="Open Sans" w:cs="Open Sans"/>
                           <w:b w:val="0"/>
                           <w:bCs w:val="0"/>
                           <w:sz w:val="16"/>
@@ -3264,7 +3327,6 @@
           </mc:Fallback>
         </mc:AlternateContent>
       </w:r>
-      <w:r/>
       <w:r>
         <mc:AlternateContent>
           <mc:Choice Requires="wpg">
@@ -3272,15 +3334,15 @@
               <wp:anchor xmlns:wp="http://schemas.openxmlformats.org/drawingml/2006/wordprocessingDrawing" xmlns:wp14="http://schemas.microsoft.com/office/word/2010/wordprocessingDrawing" distT="0" distB="0" distL="115200" distR="115200" simplePos="0" relativeHeight="11264" behindDoc="0" locked="0" layoutInCell="1" allowOverlap="1">
                 <wp:simplePos x="0" y="0"/>
                 <wp:positionH relativeFrom="column">
-                  <wp:posOffset>488137</wp:posOffset>
+                  <wp:posOffset>480976</wp:posOffset>
                 </wp:positionH>
                 <wp:positionV relativeFrom="paragraph">
-                  <wp:posOffset>2875083</wp:posOffset>
+                  <wp:posOffset>1630074</wp:posOffset>
                 </wp:positionV>
                 <wp:extent cx="1145968" cy="1062499"/>
                 <wp:effectExtent l="0" t="0" r="0" b="0"/>
                 <wp:wrapNone/>
-                <wp:docPr id="14" name=""/>
+                <wp:docPr id="15" name=""/>
                 <wp:cNvGraphicFramePr/>
                 <a:graphic xmlns:a="http://schemas.openxmlformats.org/drawingml/2006/main">
                   <a:graphicData uri="http://schemas.microsoft.com/office/word/2010/wordprocessingShape">
@@ -3363,10 +3425,9 @@
                               </w:rPr>
                               <w:t xml:space="preserve">lies the deer's path.</w:t>
                             </w:r>
-                            <w:r/>
                             <w:r>
                               <w:rPr>
-                                <w:rFonts w:ascii="Open Sans" w:hAnsi="Open Sans" w:eastAsia="Open Sans" w:cs="Open Sans"/>
+                                <w:rFonts w:ascii="Open Sans" w:hAnsi="Open Sans" w:cs="Open Sans"/>
                                 <w:b w:val="0"/>
                                 <w:bCs w:val="0"/>
                                 <w:sz w:val="16"/>
@@ -3394,7 +3455,7 @@
           </mc:Choice>
           <mc:Fallback>
             <w:pict>
-              <v:shape id="shape 13" o:spid="_x0000_s13" o:spt="202" type="#_x0000_t202" style="position:absolute;z-index:11264;o:allowoverlap:true;o:allowincell:true;mso-position-horizontal-relative:text;margin-left:38.44pt;mso-position-horizontal:absolute;mso-position-vertical-relative:text;margin-top:226.38pt;mso-position-vertical:absolute;width:90.23pt;height:83.66pt;mso-wrap-distance-left:9.07pt;mso-wrap-distance-top:0.00pt;mso-wrap-distance-right:9.07pt;mso-wrap-distance-bottom:0.00pt;rotation:0;v-text-anchor:top;visibility:visible;" filled="f" stroked="f" strokeweight="0.50pt">
+              <v:shape id="shape 14" o:spid="_x0000_s14" o:spt="202" type="#_x0000_t202" style="position:absolute;z-index:11264;o:allowoverlap:true;o:allowincell:true;mso-position-horizontal-relative:text;margin-left:37.87pt;mso-position-horizontal:absolute;mso-position-vertical-relative:text;margin-top:128.35pt;mso-position-vertical:absolute;width:90.23pt;height:83.66pt;mso-wrap-distance-left:9.07pt;mso-wrap-distance-top:0.00pt;mso-wrap-distance-right:9.07pt;mso-wrap-distance-bottom:0.00pt;rotation:0;v-text-anchor:top;visibility:visible;" filled="f" stroked="f" strokeweight="0.50pt">
                 <v:textbox inset="0,0,0,0">
                   <w:txbxContent>
                     <w:p>
@@ -3458,10 +3519,9 @@
                         </w:rPr>
                         <w:t xml:space="preserve">lies the deer's path.</w:t>
                       </w:r>
-                      <w:r/>
                       <w:r>
                         <w:rPr>
-                          <w:rFonts w:ascii="Open Sans" w:hAnsi="Open Sans" w:eastAsia="Open Sans" w:cs="Open Sans"/>
+                          <w:rFonts w:ascii="Open Sans" w:hAnsi="Open Sans" w:cs="Open Sans"/>
                           <w:b w:val="0"/>
                           <w:bCs w:val="0"/>
                           <w:sz w:val="16"/>
@@ -3485,7 +3545,6 @@
           </mc:Fallback>
         </mc:AlternateContent>
       </w:r>
-      <w:r/>
       <w:r>
         <mc:AlternateContent>
           <mc:Choice Requires="wpg">
@@ -3493,15 +3552,15 @@
               <wp:anchor xmlns:wp="http://schemas.openxmlformats.org/drawingml/2006/wordprocessingDrawing" xmlns:wp14="http://schemas.microsoft.com/office/word/2010/wordprocessingDrawing" distT="0" distB="0" distL="115200" distR="115200" simplePos="0" relativeHeight="11264" behindDoc="0" locked="0" layoutInCell="1" allowOverlap="1">
                 <wp:simplePos x="0" y="0"/>
                 <wp:positionH relativeFrom="column">
-                  <wp:posOffset>-747306</wp:posOffset>
+                  <wp:posOffset>-754467</wp:posOffset>
                 </wp:positionH>
                 <wp:positionV relativeFrom="paragraph">
-                  <wp:posOffset>2875083</wp:posOffset>
+                  <wp:posOffset>1630074</wp:posOffset>
                 </wp:positionV>
                 <wp:extent cx="1076325" cy="958866"/>
                 <wp:effectExtent l="3175" t="3175" r="3175" b="3175"/>
                 <wp:wrapNone/>
-                <wp:docPr id="15" name=""/>
+                <wp:docPr id="16" name=""/>
                 <wp:cNvGraphicFramePr/>
                 <a:graphic xmlns:a="http://schemas.openxmlformats.org/drawingml/2006/main">
                   <a:graphicData uri="http://schemas.microsoft.com/office/word/2010/wordprocessingShape">
@@ -3584,10 +3643,9 @@
                               </w:rPr>
                               <w:t xml:space="preserve">and returns to life.</w:t>
                             </w:r>
-                            <w:r/>
                             <w:r>
                               <w:rPr>
-                                <w:rFonts w:ascii="Open Sans" w:hAnsi="Open Sans" w:eastAsia="Open Sans" w:cs="Open Sans"/>
+                                <w:rFonts w:ascii="Open Sans" w:hAnsi="Open Sans" w:cs="Open Sans"/>
                                 <w:b w:val="0"/>
                                 <w:bCs w:val="0"/>
                                 <w:sz w:val="16"/>
@@ -3615,7 +3673,7 @@
           </mc:Choice>
           <mc:Fallback>
             <w:pict>
-              <v:shape id="shape 14" o:spid="_x0000_s14" o:spt="202" type="#_x0000_t202" style="position:absolute;z-index:11264;o:allowoverlap:true;o:allowincell:true;mso-position-horizontal-relative:text;margin-left:-58.84pt;mso-position-horizontal:absolute;mso-position-vertical-relative:text;margin-top:226.38pt;mso-position-vertical:absolute;width:84.75pt;height:75.50pt;mso-wrap-distance-left:9.07pt;mso-wrap-distance-top:0.00pt;mso-wrap-distance-right:9.07pt;mso-wrap-distance-bottom:0.00pt;rotation:0;v-text-anchor:top;visibility:visible;" filled="f" stroked="f" strokeweight="0.50pt">
+              <v:shape id="shape 15" o:spid="_x0000_s15" o:spt="202" type="#_x0000_t202" style="position:absolute;z-index:11264;o:allowoverlap:true;o:allowincell:true;mso-position-horizontal-relative:text;margin-left:-59.41pt;mso-position-horizontal:absolute;mso-position-vertical-relative:text;margin-top:128.35pt;mso-position-vertical:absolute;width:84.75pt;height:75.50pt;mso-wrap-distance-left:9.07pt;mso-wrap-distance-top:0.00pt;mso-wrap-distance-right:9.07pt;mso-wrap-distance-bottom:0.00pt;rotation:0;v-text-anchor:top;visibility:visible;" filled="f" stroked="f" strokeweight="0.50pt">
                 <v:textbox inset="0,0,0,0">
                   <w:txbxContent>
                     <w:p>
@@ -3679,10 +3737,9 @@
                         </w:rPr>
                         <w:t xml:space="preserve">and returns to life.</w:t>
                       </w:r>
-                      <w:r/>
                       <w:r>
                         <w:rPr>
-                          <w:rFonts w:ascii="Open Sans" w:hAnsi="Open Sans" w:eastAsia="Open Sans" w:cs="Open Sans"/>
+                          <w:rFonts w:ascii="Open Sans" w:hAnsi="Open Sans" w:cs="Open Sans"/>
                           <w:b w:val="0"/>
                           <w:bCs w:val="0"/>
                           <w:sz w:val="16"/>
@@ -3706,8 +3763,6 @@
           </mc:Fallback>
         </mc:AlternateContent>
       </w:r>
-      <w:r/>
-      <w:r/>
       <w:r>
         <mc:AlternateContent>
           <mc:Choice Requires="wpg">
@@ -3718,12 +3773,12 @@
                   <wp:posOffset>-653903</wp:posOffset>
                 </wp:positionH>
                 <wp:positionV relativeFrom="paragraph">
-                  <wp:posOffset>4241152</wp:posOffset>
+                  <wp:posOffset>2692573</wp:posOffset>
                 </wp:positionV>
                 <wp:extent cx="502478" cy="511249"/>
                 <wp:effectExtent l="0" t="0" r="0" b="0"/>
                 <wp:wrapNone/>
-                <wp:docPr id="16" name=""/>
+                <wp:docPr id="17" name=""/>
                 <wp:cNvGraphicFramePr>
                   <a:graphicFrameLocks xmlns:a="http://schemas.openxmlformats.org/drawingml/2006/main" noChangeAspect="1"/>
                 </wp:cNvGraphicFramePr>
@@ -3738,7 +3793,7 @@
                         <pic:nvPr/>
                       </pic:nvPicPr>
                       <pic:blipFill rotWithShape="1">
-                        <a:blip r:embed="rId10"/>
+                        <a:blip r:embed="rId11"/>
                         <a:stretch/>
                       </pic:blipFill>
                       <pic:spPr bwMode="auto">
@@ -3777,94 +3832,7 @@
                 <v:path o:extrusionok="f" gradientshapeok="t" o:connecttype="rect"/>
                 <o:lock v:ext="edit" aspectratio="t"/>
               </v:shapetype>
-              <v:shape id="_x0000_i15" o:spid="_x0000_s15" type="#_x0000_t75" style="position:absolute;z-index:25600;o:allowoverlap:true;o:allowincell:true;mso-position-horizontal-relative:text;margin-left:-51.49pt;mso-position-horizontal:absolute;mso-position-vertical-relative:text;margin-top:333.95pt;mso-position-vertical:absolute;width:39.57pt;height:40.26pt;mso-wrap-distance-left:9.07pt;mso-wrap-distance-top:0.00pt;mso-wrap-distance-right:9.07pt;mso-wrap-distance-bottom:0.00pt;rotation:0;z-index:1;" stroked="false">
-                <v:imagedata r:id="rId10" o:title=""/>
-                <o:lock v:ext="edit" rotation="t"/>
-              </v:shape>
-            </w:pict>
-          </mc:Fallback>
-        </mc:AlternateContent>
-      </w:r>
-      <w:r/>
-      <w:r/>
-      <w:r/>
-      <w:r/>
-      <w:r/>
-      <w:r/>
-      <w:r/>
-      <w:r/>
-      <w:r/>
-      <w:r/>
-      <w:r>
-        <mc:AlternateContent>
-          <mc:Choice Requires="wpg">
-            <w:drawing>
-              <wp:anchor xmlns:wp="http://schemas.openxmlformats.org/drawingml/2006/wordprocessingDrawing" xmlns:wp14="http://schemas.microsoft.com/office/word/2010/wordprocessingDrawing" distT="0" distB="0" distL="115200" distR="115200" simplePos="0" relativeHeight="151552" behindDoc="1" locked="0" layoutInCell="1" allowOverlap="1">
-                <wp:simplePos x="0" y="0"/>
-                <wp:positionH relativeFrom="column">
-                  <wp:posOffset>-833245</wp:posOffset>
-                </wp:positionH>
-                <wp:positionV relativeFrom="paragraph">
-                  <wp:posOffset>942975</wp:posOffset>
-                </wp:positionV>
-                <wp:extent cx="7269825" cy="2148702"/>
-                <wp:effectExtent l="0" t="0" r="0" b="0"/>
-                <wp:wrapNone/>
-                <wp:docPr id="17" name=""/>
-                <wp:cNvGraphicFramePr>
-                  <a:graphicFrameLocks xmlns:a="http://schemas.openxmlformats.org/drawingml/2006/main" noChangeAspect="1"/>
-                </wp:cNvGraphicFramePr>
-                <a:graphic xmlns:a="http://schemas.openxmlformats.org/drawingml/2006/main">
-                  <a:graphicData uri="http://schemas.openxmlformats.org/drawingml/2006/picture">
-                    <pic:pic xmlns:pic="http://schemas.openxmlformats.org/drawingml/2006/picture">
-                      <pic:nvPicPr>
-                        <pic:cNvPr id="1112294751" name=""/>
-                        <pic:cNvPicPr>
-                          <a:picLocks noChangeAspect="1"/>
-                        </pic:cNvPicPr>
-                        <pic:nvPr/>
-                      </pic:nvPicPr>
-                      <pic:blipFill rotWithShape="1">
-                        <a:blip r:embed="rId11"/>
-                        <a:stretch/>
-                      </pic:blipFill>
-                      <pic:spPr bwMode="auto">
-                        <a:xfrm flipH="0" flipV="0">
-                          <a:off x="0" y="0"/>
-                          <a:ext cx="7269824" cy="2148702"/>
-                        </a:xfrm>
-                        <a:prstGeom prst="rect">
-                          <a:avLst/>
-                        </a:prstGeom>
-                      </pic:spPr>
-                    </pic:pic>
-                  </a:graphicData>
-                </a:graphic>
-              </wp:anchor>
-            </w:drawing>
-          </mc:Choice>
-          <mc:Fallback>
-            <w:pict>
-              <v:shapetype id="_x0000_t75" coordsize="21600,21600" o:spt="75" o:preferrelative="t" path="m@4@5l@4@11@9@11@9@5xe" filled="f" stroked="f">
-                <v:stroke joinstyle="miter"/>
-                <v:formulas>
-                  <v:f eqn="if lineDrawn pixelLineWidth 0"/>
-                  <v:f eqn="sum @0 1 0"/>
-                  <v:f eqn="sum 0 0 @1"/>
-                  <v:f eqn="prod @2 1 2"/>
-                  <v:f eqn="prod @3 21600 pixelWidth"/>
-                  <v:f eqn="prod @3 21600 pixelHeight"/>
-                  <v:f eqn="sum @0 0 1"/>
-                  <v:f eqn="prod @6 1 2"/>
-                  <v:f eqn="prod @7 21600 pixelWidth"/>
-                  <v:f eqn="sum @8 21600 0"/>
-                  <v:f eqn="prod @7 21600 pixelHeight"/>
-                  <v:f eqn="sum @10 21600 0"/>
-                </v:formulas>
-                <v:path o:extrusionok="f" gradientshapeok="t" o:connecttype="rect"/>
-                <o:lock v:ext="edit" aspectratio="t"/>
-              </v:shapetype>
-              <v:shape id="_x0000_i16" o:spid="_x0000_s16" type="#_x0000_t75" style="position:absolute;z-index:-151552;o:allowoverlap:true;o:allowincell:true;mso-position-horizontal-relative:text;margin-left:-65.61pt;mso-position-horizontal:absolute;mso-position-vertical-relative:text;margin-top:74.25pt;mso-position-vertical:absolute;width:572.43pt;height:169.19pt;mso-wrap-distance-left:9.07pt;mso-wrap-distance-top:0.00pt;mso-wrap-distance-right:9.07pt;mso-wrap-distance-bottom:0.00pt;z-index:1;" stroked="false">
+              <v:shape id="_x0000_i16" o:spid="_x0000_s16" type="#_x0000_t75" style="position:absolute;z-index:25600;o:allowoverlap:true;o:allowincell:true;mso-position-horizontal-relative:text;margin-left:-51.49pt;mso-position-horizontal:absolute;mso-position-vertical-relative:text;margin-top:212.01pt;mso-position-vertical:absolute;width:39.57pt;height:40.26pt;mso-wrap-distance-left:9.07pt;mso-wrap-distance-top:0.00pt;mso-wrap-distance-right:9.07pt;mso-wrap-distance-bottom:0.00pt;rotation:0;z-index:1;" stroked="false">
                 <v:imagedata r:id="rId11" o:title=""/>
                 <o:lock v:ext="edit" rotation="t"/>
               </v:shape>
@@ -3872,9 +3840,6 @@
           </mc:Fallback>
         </mc:AlternateContent>
       </w:r>
-      <w:r/>
-      <w:r/>
-      <w:r/>
       <w:r/>
       <w:r/>
       <w:r/>

</xml_diff>

<commit_message>
Add new haiku docs and update existing ones
Co-Authored-By: Claude Sonnet 5 <noreply@anthropic.com>
</commit_message>
<xml_diff>
--- a/100(75+25).docx
+++ b/100(75+25).docx
@@ -316,12 +316,6 @@
       </w:r>
       <w:r>
         <w:rPr>
-          <w:lang w:val="ja-JP"/>
-        </w:rPr>
-      </w:r>
-      <w:r/>
-      <w:r>
-        <w:rPr>
           <w:highlight w:val="none"/>
         </w:rPr>
       </w:r>
@@ -378,7 +372,6 @@
         <w:ind/>
         <w:rPr/>
       </w:pPr>
-      <w:r/>
       <w:r>
         <mc:AlternateContent>
           <mc:Choice Requires="wpg">
@@ -457,15 +450,6 @@
                                 <w:szCs w:val="16"/>
                               </w:rPr>
                             </w:r>
-                            <w:r>
-                              <w:rPr>
-                                <w:rFonts w:ascii="Open Sans" w:hAnsi="Open Sans" w:eastAsia="Open Sans" w:cs="Open Sans"/>
-                                <w:b w:val="0"/>
-                                <w:bCs w:val="0"/>
-                                <w:sz w:val="16"/>
-                                <w:szCs w:val="16"/>
-                              </w:rPr>
-                            </w:r>
                           </w:p>
                           <w:p>
                             <w:pPr>
@@ -508,15 +492,6 @@
                                 <w:szCs w:val="16"/>
                               </w:rPr>
                             </w:r>
-                            <w:r>
-                              <w:rPr>
-                                <w:rFonts w:ascii="Open Sans" w:hAnsi="Open Sans" w:eastAsia="Open Sans" w:cs="Open Sans"/>
-                                <w:b w:val="0"/>
-                                <w:bCs w:val="0"/>
-                                <w:sz w:val="16"/>
-                                <w:szCs w:val="16"/>
-                              </w:rPr>
-                            </w:r>
                           </w:p>
                           <w:p>
                             <w:pPr>
@@ -540,15 +515,6 @@
                                 <w:szCs w:val="16"/>
                               </w:rPr>
                               <w:t xml:space="preserve">in the spring.</w:t>
-                            </w:r>
-                            <w:r>
-                              <w:rPr>
-                                <w:rFonts w:ascii="Open Sans" w:hAnsi="Open Sans" w:cs="Open Sans"/>
-                                <w:b w:val="0"/>
-                                <w:bCs w:val="0"/>
-                                <w:sz w:val="16"/>
-                                <w:szCs w:val="16"/>
-                              </w:rPr>
                             </w:r>
                             <w:r>
                               <w:rPr>
@@ -624,15 +590,6 @@
                           <w:szCs w:val="16"/>
                         </w:rPr>
                       </w:r>
-                      <w:r>
-                        <w:rPr>
-                          <w:rFonts w:ascii="Open Sans" w:hAnsi="Open Sans" w:eastAsia="Open Sans" w:cs="Open Sans"/>
-                          <w:b w:val="0"/>
-                          <w:bCs w:val="0"/>
-                          <w:sz w:val="16"/>
-                          <w:szCs w:val="16"/>
-                        </w:rPr>
-                      </w:r>
                     </w:p>
                     <w:p>
                       <w:pPr>
@@ -656,15 +613,6 @@
                           <w:szCs w:val="16"/>
                         </w:rPr>
                         <w:t xml:space="preserve">sugi saplings enter the earth</w:t>
-                      </w:r>
-                      <w:r>
-                        <w:rPr>
-                          <w:rFonts w:ascii="Open Sans" w:hAnsi="Open Sans" w:eastAsia="Open Sans" w:cs="Open Sans"/>
-                          <w:b w:val="0"/>
-                          <w:bCs w:val="0"/>
-                          <w:sz w:val="16"/>
-                          <w:szCs w:val="16"/>
-                        </w:rPr>
                       </w:r>
                       <w:r>
                         <w:rPr>
@@ -726,15 +674,6 @@
                           <w:szCs w:val="16"/>
                         </w:rPr>
                       </w:r>
-                      <w:r>
-                        <w:rPr>
-                          <w:rFonts w:ascii="Open Sans" w:hAnsi="Open Sans" w:cs="Open Sans"/>
-                          <w:b w:val="0"/>
-                          <w:bCs w:val="0"/>
-                          <w:sz w:val="16"/>
-                          <w:szCs w:val="16"/>
-                        </w:rPr>
-                      </w:r>
                     </w:p>
                   </w:txbxContent>
                 </v:textbox>
@@ -743,7 +682,6 @@
           </mc:Fallback>
         </mc:AlternateContent>
       </w:r>
-      <w:r/>
       <w:r>
         <mc:AlternateContent>
           <mc:Choice Requires="wpg">
@@ -822,15 +760,6 @@
                                 <w:szCs w:val="16"/>
                               </w:rPr>
                             </w:r>
-                            <w:r>
-                              <w:rPr>
-                                <w:rFonts w:ascii="Open Sans" w:hAnsi="Open Sans" w:eastAsia="Open Sans" w:cs="Open Sans"/>
-                                <w:b w:val="0"/>
-                                <w:bCs w:val="0"/>
-                                <w:sz w:val="16"/>
-                                <w:szCs w:val="16"/>
-                              </w:rPr>
-                            </w:r>
                           </w:p>
                           <w:p>
                             <w:pPr>
@@ -873,15 +802,6 @@
                                 <w:szCs w:val="16"/>
                               </w:rPr>
                             </w:r>
-                            <w:r>
-                              <w:rPr>
-                                <w:rFonts w:ascii="Open Sans" w:hAnsi="Open Sans" w:eastAsia="Open Sans" w:cs="Open Sans"/>
-                                <w:b w:val="0"/>
-                                <w:bCs w:val="0"/>
-                                <w:sz w:val="16"/>
-                                <w:szCs w:val="16"/>
-                              </w:rPr>
-                            </w:r>
                           </w:p>
                           <w:p>
                             <w:pPr>
@@ -905,15 +825,6 @@
                                 <w:szCs w:val="16"/>
                               </w:rPr>
                               <w:t xml:space="preserve">remains.</w:t>
-                            </w:r>
-                            <w:r>
-                              <w:rPr>
-                                <w:rFonts w:ascii="Open Sans" w:hAnsi="Open Sans" w:eastAsia="Open Sans" w:cs="Open Sans"/>
-                                <w:b w:val="0"/>
-                                <w:bCs w:val="0"/>
-                                <w:sz w:val="16"/>
-                                <w:szCs w:val="16"/>
-                              </w:rPr>
                             </w:r>
                             <w:r>
                               <w:rPr>
@@ -989,15 +900,6 @@
                           <w:szCs w:val="16"/>
                         </w:rPr>
                       </w:r>
-                      <w:r>
-                        <w:rPr>
-                          <w:rFonts w:ascii="Open Sans" w:hAnsi="Open Sans" w:eastAsia="Open Sans" w:cs="Open Sans"/>
-                          <w:b w:val="0"/>
-                          <w:bCs w:val="0"/>
-                          <w:sz w:val="16"/>
-                          <w:szCs w:val="16"/>
-                        </w:rPr>
-                      </w:r>
                     </w:p>
                     <w:p>
                       <w:pPr>
@@ -1021,15 +923,6 @@
                           <w:szCs w:val="16"/>
                         </w:rPr>
                         <w:t xml:space="preserve">the warmth of human hands</w:t>
-                      </w:r>
-                      <w:r>
-                        <w:rPr>
-                          <w:rFonts w:ascii="Open Sans" w:hAnsi="Open Sans" w:eastAsia="Open Sans" w:cs="Open Sans"/>
-                          <w:b w:val="0"/>
-                          <w:bCs w:val="0"/>
-                          <w:sz w:val="16"/>
-                          <w:szCs w:val="16"/>
-                        </w:rPr>
                       </w:r>
                       <w:r>
                         <w:rPr>
@@ -1091,15 +984,6 @@
                           <w:szCs w:val="16"/>
                         </w:rPr>
                       </w:r>
-                      <w:r>
-                        <w:rPr>
-                          <w:rFonts w:ascii="Open Sans" w:hAnsi="Open Sans" w:eastAsia="Open Sans" w:cs="Open Sans"/>
-                          <w:b w:val="0"/>
-                          <w:bCs w:val="0"/>
-                          <w:sz w:val="16"/>
-                          <w:szCs w:val="16"/>
-                        </w:rPr>
-                      </w:r>
                     </w:p>
                   </w:txbxContent>
                 </v:textbox>
@@ -1108,7 +992,6 @@
           </mc:Fallback>
         </mc:AlternateContent>
       </w:r>
-      <w:r/>
       <w:r>
         <mc:AlternateContent>
           <mc:Choice Requires="wpg">
@@ -1187,15 +1070,6 @@
                                 <w:szCs w:val="16"/>
                               </w:rPr>
                             </w:r>
-                            <w:r>
-                              <w:rPr>
-                                <w:rFonts w:ascii="Open Sans" w:hAnsi="Open Sans" w:eastAsia="Open Sans" w:cs="Open Sans"/>
-                                <w:b w:val="0"/>
-                                <w:bCs w:val="0"/>
-                                <w:sz w:val="16"/>
-                                <w:szCs w:val="16"/>
-                              </w:rPr>
-                            </w:r>
                           </w:p>
                           <w:p>
                             <w:pPr>
@@ -1238,15 +1112,6 @@
                                 <w:szCs w:val="16"/>
                               </w:rPr>
                             </w:r>
-                            <w:r>
-                              <w:rPr>
-                                <w:rFonts w:ascii="Open Sans" w:hAnsi="Open Sans" w:eastAsia="Open Sans" w:cs="Open Sans"/>
-                                <w:b w:val="0"/>
-                                <w:bCs w:val="0"/>
-                                <w:sz w:val="16"/>
-                                <w:szCs w:val="16"/>
-                              </w:rPr>
-                            </w:r>
                           </w:p>
                           <w:p>
                             <w:pPr>
@@ -1267,12 +1132,6 @@
                                 <w:szCs w:val="16"/>
                               </w:rPr>
                               <w:t xml:space="preserve">and grow old.</w:t>
-                            </w:r>
-                            <w:r>
-                              <w:rPr>
-                                <w:sz w:val="16"/>
-                                <w:szCs w:val="16"/>
-                              </w:rPr>
                             </w:r>
                             <w:r>
                               <w:rPr>
@@ -1342,15 +1201,6 @@
                           <w:szCs w:val="16"/>
                         </w:rPr>
                       </w:r>
-                      <w:r>
-                        <w:rPr>
-                          <w:rFonts w:ascii="Open Sans" w:hAnsi="Open Sans" w:eastAsia="Open Sans" w:cs="Open Sans"/>
-                          <w:b w:val="0"/>
-                          <w:bCs w:val="0"/>
-                          <w:sz w:val="16"/>
-                          <w:szCs w:val="16"/>
-                        </w:rPr>
-                      </w:r>
                     </w:p>
                     <w:p>
                       <w:pPr>
@@ -1374,15 +1224,6 @@
                           <w:szCs w:val="16"/>
                         </w:rPr>
                         <w:t xml:space="preserve">the sugi reach toward heaven</w:t>
-                      </w:r>
-                      <w:r>
-                        <w:rPr>
-                          <w:rFonts w:ascii="Open Sans" w:hAnsi="Open Sans" w:eastAsia="Open Sans" w:cs="Open Sans"/>
-                          <w:b w:val="0"/>
-                          <w:bCs w:val="0"/>
-                          <w:sz w:val="16"/>
-                          <w:szCs w:val="16"/>
-                        </w:rPr>
                       </w:r>
                       <w:r>
                         <w:rPr>
@@ -1435,12 +1276,6 @@
                           <w:szCs w:val="16"/>
                         </w:rPr>
                       </w:r>
-                      <w:r>
-                        <w:rPr>
-                          <w:sz w:val="16"/>
-                          <w:szCs w:val="16"/>
-                        </w:rPr>
-                      </w:r>
                     </w:p>
                   </w:txbxContent>
                 </v:textbox>
@@ -1449,7 +1284,6 @@
           </mc:Fallback>
         </mc:AlternateContent>
       </w:r>
-      <w:r/>
       <w:r>
         <mc:AlternateContent>
           <mc:Choice Requires="wpg">
@@ -1528,15 +1362,6 @@
                                 <w:szCs w:val="16"/>
                               </w:rPr>
                             </w:r>
-                            <w:r>
-                              <w:rPr>
-                                <w:rFonts w:ascii="Open Sans" w:hAnsi="Open Sans" w:eastAsia="Open Sans" w:cs="Open Sans"/>
-                                <w:b w:val="0"/>
-                                <w:bCs w:val="0"/>
-                                <w:sz w:val="16"/>
-                                <w:szCs w:val="16"/>
-                              </w:rPr>
-                            </w:r>
                           </w:p>
                           <w:p>
                             <w:pPr>
@@ -1560,15 +1385,6 @@
                                 <w:szCs w:val="16"/>
                               </w:rPr>
                               <w:t xml:space="preserve">the deer eat only moonlight.</w:t>
-                            </w:r>
-                            <w:r>
-                              <w:rPr>
-                                <w:rFonts w:ascii="Open Sans" w:hAnsi="Open Sans" w:cs="Open Sans"/>
-                                <w:b w:val="0"/>
-                                <w:bCs w:val="0"/>
-                                <w:sz w:val="16"/>
-                                <w:szCs w:val="16"/>
-                              </w:rPr>
                             </w:r>
                             <w:r>
                               <w:rPr>
@@ -1644,15 +1460,6 @@
                           <w:szCs w:val="16"/>
                         </w:rPr>
                       </w:r>
-                      <w:r>
-                        <w:rPr>
-                          <w:rFonts w:ascii="Open Sans" w:hAnsi="Open Sans" w:eastAsia="Open Sans" w:cs="Open Sans"/>
-                          <w:b w:val="0"/>
-                          <w:bCs w:val="0"/>
-                          <w:sz w:val="16"/>
-                          <w:szCs w:val="16"/>
-                        </w:rPr>
-                      </w:r>
                     </w:p>
                     <w:p>
                       <w:pPr>
@@ -1695,15 +1502,6 @@
                           <w:szCs w:val="16"/>
                         </w:rPr>
                       </w:r>
-                      <w:r>
-                        <w:rPr>
-                          <w:rFonts w:ascii="Open Sans" w:hAnsi="Open Sans" w:cs="Open Sans"/>
-                          <w:b w:val="0"/>
-                          <w:bCs w:val="0"/>
-                          <w:sz w:val="16"/>
-                          <w:szCs w:val="16"/>
-                        </w:rPr>
-                      </w:r>
                     </w:p>
                   </w:txbxContent>
                 </v:textbox>
@@ -1712,7 +1510,6 @@
           </mc:Fallback>
         </mc:AlternateContent>
       </w:r>
-      <w:r/>
       <w:r>
         <mc:AlternateContent>
           <mc:Choice Requires="wpg">
@@ -1791,15 +1588,6 @@
                                 <w:szCs w:val="16"/>
                               </w:rPr>
                             </w:r>
-                            <w:r>
-                              <w:rPr>
-                                <w:rFonts w:ascii="Open Sans" w:hAnsi="Open Sans" w:eastAsia="Open Sans" w:cs="Open Sans"/>
-                                <w:b w:val="0"/>
-                                <w:bCs w:val="0"/>
-                                <w:sz w:val="16"/>
-                                <w:szCs w:val="16"/>
-                              </w:rPr>
-                            </w:r>
                           </w:p>
                           <w:p>
                             <w:pPr>
@@ -1842,15 +1630,6 @@
                                 <w:szCs w:val="16"/>
                               </w:rPr>
                             </w:r>
-                            <w:r>
-                              <w:rPr>
-                                <w:rFonts w:ascii="Open Sans" w:hAnsi="Open Sans" w:eastAsia="Open Sans" w:cs="Open Sans"/>
-                                <w:b w:val="0"/>
-                                <w:bCs w:val="0"/>
-                                <w:sz w:val="16"/>
-                                <w:szCs w:val="16"/>
-                              </w:rPr>
-                            </w:r>
                           </w:p>
                           <w:p>
                             <w:pPr>
@@ -1874,15 +1653,6 @@
                                 <w:szCs w:val="16"/>
                               </w:rPr>
                               <w:t xml:space="preserve">crosses the years.</w:t>
-                            </w:r>
-                            <w:r>
-                              <w:rPr>
-                                <w:rFonts w:ascii="Open Sans" w:hAnsi="Open Sans" w:cs="Open Sans"/>
-                                <w:b w:val="0"/>
-                                <w:bCs w:val="0"/>
-                                <w:sz w:val="16"/>
-                                <w:szCs w:val="16"/>
-                              </w:rPr>
                             </w:r>
                             <w:r>
                               <w:rPr>
@@ -1958,15 +1728,6 @@
                           <w:szCs w:val="16"/>
                         </w:rPr>
                       </w:r>
-                      <w:r>
-                        <w:rPr>
-                          <w:rFonts w:ascii="Open Sans" w:hAnsi="Open Sans" w:eastAsia="Open Sans" w:cs="Open Sans"/>
-                          <w:b w:val="0"/>
-                          <w:bCs w:val="0"/>
-                          <w:sz w:val="16"/>
-                          <w:szCs w:val="16"/>
-                        </w:rPr>
-                      </w:r>
                     </w:p>
                     <w:p>
                       <w:pPr>
@@ -1990,15 +1751,6 @@
                           <w:szCs w:val="16"/>
                         </w:rPr>
                         <w:t xml:space="preserve">a nameless prayer</w:t>
-                      </w:r>
-                      <w:r>
-                        <w:rPr>
-                          <w:rFonts w:ascii="Open Sans" w:hAnsi="Open Sans" w:eastAsia="Open Sans" w:cs="Open Sans"/>
-                          <w:b w:val="0"/>
-                          <w:bCs w:val="0"/>
-                          <w:sz w:val="16"/>
-                          <w:szCs w:val="16"/>
-                        </w:rPr>
                       </w:r>
                       <w:r>
                         <w:rPr>
@@ -2060,15 +1812,6 @@
                           <w:szCs w:val="16"/>
                         </w:rPr>
                       </w:r>
-                      <w:r>
-                        <w:rPr>
-                          <w:rFonts w:ascii="Open Sans" w:hAnsi="Open Sans" w:cs="Open Sans"/>
-                          <w:b w:val="0"/>
-                          <w:bCs w:val="0"/>
-                          <w:sz w:val="16"/>
-                          <w:szCs w:val="16"/>
-                        </w:rPr>
-                      </w:r>
                     </w:p>
                   </w:txbxContent>
                 </v:textbox>
@@ -2077,7 +1820,6 @@
           </mc:Fallback>
         </mc:AlternateContent>
       </w:r>
-      <w:r/>
       <w:r>
         <mc:AlternateContent>
           <mc:Choice Requires="wpg">
@@ -2156,15 +1898,6 @@
                                 <w:szCs w:val="16"/>
                               </w:rPr>
                             </w:r>
-                            <w:r>
-                              <w:rPr>
-                                <w:rFonts w:ascii="Open Sans" w:hAnsi="Open Sans" w:eastAsia="Open Sans" w:cs="Open Sans"/>
-                                <w:b w:val="0"/>
-                                <w:bCs w:val="0"/>
-                                <w:sz w:val="16"/>
-                                <w:szCs w:val="16"/>
-                              </w:rPr>
-                            </w:r>
                           </w:p>
                           <w:p>
                             <w:pPr>
@@ -2188,15 +1921,6 @@
                                 <w:szCs w:val="16"/>
                               </w:rPr>
                               <w:t xml:space="preserve">there are roots.</w:t>
-                            </w:r>
-                            <w:r>
-                              <w:rPr>
-                                <w:rFonts w:ascii="Open Sans" w:hAnsi="Open Sans" w:cs="Open Sans"/>
-                                <w:b w:val="0"/>
-                                <w:bCs w:val="0"/>
-                                <w:sz w:val="16"/>
-                                <w:szCs w:val="16"/>
-                              </w:rPr>
                             </w:r>
                             <w:r>
                               <w:rPr>
@@ -2272,15 +1996,6 @@
                           <w:szCs w:val="16"/>
                         </w:rPr>
                       </w:r>
-                      <w:r>
-                        <w:rPr>
-                          <w:rFonts w:ascii="Open Sans" w:hAnsi="Open Sans" w:eastAsia="Open Sans" w:cs="Open Sans"/>
-                          <w:b w:val="0"/>
-                          <w:bCs w:val="0"/>
-                          <w:sz w:val="16"/>
-                          <w:szCs w:val="16"/>
-                        </w:rPr>
-                      </w:r>
                     </w:p>
                     <w:p>
                       <w:pPr>
@@ -2323,15 +2038,6 @@
                           <w:szCs w:val="16"/>
                         </w:rPr>
                       </w:r>
-                      <w:r>
-                        <w:rPr>
-                          <w:rFonts w:ascii="Open Sans" w:hAnsi="Open Sans" w:cs="Open Sans"/>
-                          <w:b w:val="0"/>
-                          <w:bCs w:val="0"/>
-                          <w:sz w:val="16"/>
-                          <w:szCs w:val="16"/>
-                        </w:rPr>
-                      </w:r>
                     </w:p>
                   </w:txbxContent>
                 </v:textbox>
@@ -2341,7 +2047,6 @@
         </mc:AlternateContent>
       </w:r>
       <w:r/>
-      <w:r/>
     </w:p>
     <w:p>
       <w:pPr>
@@ -2362,9 +2067,14 @@
       </w:pPr>
       <w:r/>
       <w:r/>
-      <w:r/>
-      <w:r/>
-      <w:r/>
+    </w:p>
+    <w:p>
+      <w:pPr>
+        <w:pBdr/>
+        <w:spacing/>
+        <w:ind/>
+        <w:rPr/>
+      </w:pPr>
       <w:r/>
       <w:r/>
     </w:p>
@@ -2375,17 +2085,6 @@
         <w:ind/>
         <w:rPr/>
       </w:pPr>
-      <w:r/>
-      <w:r/>
-    </w:p>
-    <w:p>
-      <w:pPr>
-        <w:pBdr/>
-        <w:spacing/>
-        <w:ind/>
-        <w:rPr/>
-      </w:pPr>
-      <w:r/>
       <w:r>
         <mc:AlternateContent>
           <mc:Choice Requires="wpg">
@@ -2463,7 +2162,6 @@
           </mc:Fallback>
         </mc:AlternateContent>
       </w:r>
-      <w:r/>
       <w:r/>
     </w:p>
     <w:p>
@@ -3763,85 +3461,6 @@
           </mc:Fallback>
         </mc:AlternateContent>
       </w:r>
-      <w:r>
-        <mc:AlternateContent>
-          <mc:Choice Requires="wpg">
-            <w:drawing>
-              <wp:anchor xmlns:wp="http://schemas.openxmlformats.org/drawingml/2006/wordprocessingDrawing" xmlns:wp14="http://schemas.microsoft.com/office/word/2010/wordprocessingDrawing" distT="0" distB="0" distL="115200" distR="115200" simplePos="0" relativeHeight="25600" behindDoc="0" locked="0" layoutInCell="1" allowOverlap="1">
-                <wp:simplePos x="0" y="0"/>
-                <wp:positionH relativeFrom="column">
-                  <wp:posOffset>-653903</wp:posOffset>
-                </wp:positionH>
-                <wp:positionV relativeFrom="paragraph">
-                  <wp:posOffset>2692573</wp:posOffset>
-                </wp:positionV>
-                <wp:extent cx="502478" cy="511249"/>
-                <wp:effectExtent l="0" t="0" r="0" b="0"/>
-                <wp:wrapNone/>
-                <wp:docPr id="17" name=""/>
-                <wp:cNvGraphicFramePr>
-                  <a:graphicFrameLocks xmlns:a="http://schemas.openxmlformats.org/drawingml/2006/main" noChangeAspect="1"/>
-                </wp:cNvGraphicFramePr>
-                <a:graphic xmlns:a="http://schemas.openxmlformats.org/drawingml/2006/main">
-                  <a:graphicData uri="http://schemas.openxmlformats.org/drawingml/2006/picture">
-                    <pic:pic xmlns:pic="http://schemas.openxmlformats.org/drawingml/2006/picture">
-                      <pic:nvPicPr>
-                        <pic:cNvPr id="1885730569" name=""/>
-                        <pic:cNvPicPr>
-                          <a:picLocks noChangeAspect="1"/>
-                        </pic:cNvPicPr>
-                        <pic:nvPr/>
-                      </pic:nvPicPr>
-                      <pic:blipFill rotWithShape="1">
-                        <a:blip r:embed="rId11"/>
-                        <a:stretch/>
-                      </pic:blipFill>
-                      <pic:spPr bwMode="auto">
-                        <a:xfrm rot="0" flipH="0" flipV="0">
-                          <a:off x="0" y="0"/>
-                          <a:ext cx="502477" cy="511249"/>
-                        </a:xfrm>
-                        <a:prstGeom prst="rect">
-                          <a:avLst/>
-                        </a:prstGeom>
-                      </pic:spPr>
-                    </pic:pic>
-                  </a:graphicData>
-                </a:graphic>
-              </wp:anchor>
-            </w:drawing>
-          </mc:Choice>
-          <mc:Fallback>
-            <w:pict>
-              <v:shapetype id="_x0000_t75" coordsize="21600,21600" o:spt="75" o:preferrelative="t" path="m@4@5l@4@11@9@11@9@5xe" filled="f" stroked="f">
-                <v:stroke joinstyle="miter"/>
-                <v:formulas>
-                  <v:f eqn="if lineDrawn pixelLineWidth 0"/>
-                  <v:f eqn="sum @0 1 0"/>
-                  <v:f eqn="sum 0 0 @1"/>
-                  <v:f eqn="prod @2 1 2"/>
-                  <v:f eqn="prod @3 21600 pixelWidth"/>
-                  <v:f eqn="prod @3 21600 pixelHeight"/>
-                  <v:f eqn="sum @0 0 1"/>
-                  <v:f eqn="prod @6 1 2"/>
-                  <v:f eqn="prod @7 21600 pixelWidth"/>
-                  <v:f eqn="sum @8 21600 0"/>
-                  <v:f eqn="prod @7 21600 pixelHeight"/>
-                  <v:f eqn="sum @10 21600 0"/>
-                </v:formulas>
-                <v:path o:extrusionok="f" gradientshapeok="t" o:connecttype="rect"/>
-                <o:lock v:ext="edit" aspectratio="t"/>
-              </v:shapetype>
-              <v:shape id="_x0000_i16" o:spid="_x0000_s16" type="#_x0000_t75" style="position:absolute;z-index:25600;o:allowoverlap:true;o:allowincell:true;mso-position-horizontal-relative:text;margin-left:-51.49pt;mso-position-horizontal:absolute;mso-position-vertical-relative:text;margin-top:212.01pt;mso-position-vertical:absolute;width:39.57pt;height:40.26pt;mso-wrap-distance-left:9.07pt;mso-wrap-distance-top:0.00pt;mso-wrap-distance-right:9.07pt;mso-wrap-distance-bottom:0.00pt;rotation:0;z-index:1;" stroked="false">
-                <v:imagedata r:id="rId11" o:title=""/>
-                <o:lock v:ext="edit" rotation="t"/>
-              </v:shape>
-            </w:pict>
-          </mc:Fallback>
-        </mc:AlternateContent>
-      </w:r>
-      <w:r/>
-      <w:r/>
       <w:r/>
       <w:r/>
     </w:p>

</xml_diff>